<commit_message>
Code a NLC system
</commit_message>
<xml_diff>
--- a/Project paper.docx
+++ b/Project paper.docx
@@ -50,8 +50,26 @@
           <w:szCs w:val="24"/>
           <w:lang w:val="en-US"/>
         </w:rPr>
+        <w:t xml:space="preserve"> (Leader)</w:t>
+      </w:r>
+      <w:r>
+        <w:rPr>
+          <w:rFonts w:ascii="Calibri" w:hAnsi="Calibri" w:cs="Calibri"/>
+          <w:sz w:val="24"/>
+          <w:szCs w:val="24"/>
+          <w:lang w:val="en-US"/>
+        </w:rPr>
         <w:t>, Utkarsh and Anmol</w:t>
       </w:r>
+      <w:r>
+        <w:rPr>
+          <w:rFonts w:ascii="Calibri" w:hAnsi="Calibri" w:cs="Calibri"/>
+          <w:sz w:val="24"/>
+          <w:szCs w:val="24"/>
+          <w:lang w:val="en-US"/>
+        </w:rPr>
+        <w:t>,</w:t>
+      </w:r>
     </w:p>
     <w:p>
       <w:pPr>
@@ -70,6 +88,26 @@
           <w:szCs w:val="24"/>
           <w:lang w:val="en-US"/>
         </w:rPr>
+        <w:t>Team Centrosomes,</w:t>
+      </w:r>
+    </w:p>
+    <w:p>
+      <w:pPr>
+        <w:jc w:val="center"/>
+        <w:rPr>
+          <w:rFonts w:ascii="Calibri" w:hAnsi="Calibri" w:cs="Calibri"/>
+          <w:sz w:val="24"/>
+          <w:szCs w:val="24"/>
+          <w:lang w:val="en-US"/>
+        </w:rPr>
+      </w:pPr>
+      <w:r>
+        <w:rPr>
+          <w:rFonts w:ascii="Calibri" w:hAnsi="Calibri" w:cs="Calibri"/>
+          <w:sz w:val="24"/>
+          <w:szCs w:val="24"/>
+          <w:lang w:val="en-US"/>
+        </w:rPr>
         <w:t>Mount Litera Zee School</w:t>
       </w:r>
       <w:r>
@@ -91,15 +129,25 @@
           <w:lang w:val="en-US"/>
         </w:rPr>
       </w:pPr>
-    </w:p>
-    <w:p>
-      <w:pPr>
-        <w:rPr>
-          <w:rFonts w:ascii="Calibri" w:hAnsi="Calibri" w:cs="Calibri"/>
-          <w:b/>
-          <w:i/>
-          <w:sz w:val="28"/>
-          <w:szCs w:val="28"/>
+      <w:bookmarkStart w:id="0" w:name="_GoBack"/>
+      <w:bookmarkEnd w:id="0"/>
+    </w:p>
+    <w:p>
+      <w:pPr>
+        <w:rPr>
+          <w:rFonts w:ascii="Calibri" w:hAnsi="Calibri" w:cs="Calibri"/>
+          <w:sz w:val="24"/>
+          <w:szCs w:val="24"/>
+          <w:lang w:val="en-US"/>
+        </w:rPr>
+      </w:pPr>
+    </w:p>
+    <w:p>
+      <w:pPr>
+        <w:rPr>
+          <w:rFonts w:ascii="Calibri" w:hAnsi="Calibri" w:cs="Calibri"/>
+          <w:sz w:val="24"/>
+          <w:szCs w:val="24"/>
           <w:lang w:val="en-US"/>
         </w:rPr>
         <w:sectPr>
@@ -442,7 +490,16 @@
           <w:sz w:val="24"/>
           <w:szCs w:val="24"/>
         </w:rPr>
-        <w:t xml:space="preserve"> The user provides input via speech or some other method, and the system generates responses in the form of utterances delivered by speech, text or some other method.</w:t>
+        <w:t xml:space="preserve"> The user provides input via speech or some other method, and the system generates responses in the form of utterances delivered by </w:t>
+      </w:r>
+      <w:r>
+        <w:rPr>
+          <w:rFonts w:ascii="Calibri" w:hAnsi="Calibri" w:cs="Calibri"/>
+          <w:sz w:val="24"/>
+          <w:szCs w:val="24"/>
+        </w:rPr>
+        <w:lastRenderedPageBreak/>
+        <w:t>speech, text or some other method.</w:t>
       </w:r>
       <w:r>
         <w:rPr>
@@ -467,17 +524,7 @@
           <w:sz w:val="24"/>
           <w:szCs w:val="24"/>
         </w:rPr>
-        <w:t xml:space="preserve">spoken </w:t>
-      </w:r>
-      <w:r>
-        <w:rPr>
-          <w:rFonts w:ascii="Calibri" w:hAnsi="Calibri" w:cs="Calibri"/>
-          <w:b/>
-          <w:sz w:val="24"/>
-          <w:szCs w:val="24"/>
-        </w:rPr>
-        <w:lastRenderedPageBreak/>
-        <w:t>interaction.</w:t>
+        <w:t>spoken interaction.</w:t>
       </w:r>
       <w:r>
         <w:rPr>
@@ -738,7 +785,16 @@
           <w:sz w:val="24"/>
           <w:szCs w:val="24"/>
         </w:rPr>
-        <w:t xml:space="preserve">. The WINTER AI program uses ML algorithms to learn from the data that is given to it. This data is then used to improve the AI's performance, </w:t>
+        <w:t xml:space="preserve">. The WINTER AI program uses ML algorithms to learn from the data </w:t>
+      </w:r>
+      <w:r>
+        <w:rPr>
+          <w:rFonts w:ascii="Calibri" w:hAnsi="Calibri" w:cs="Calibri"/>
+          <w:sz w:val="24"/>
+          <w:szCs w:val="24"/>
+        </w:rPr>
+        <w:lastRenderedPageBreak/>
+        <w:t xml:space="preserve">that is given to it. This data is then used to improve the AI's performance, </w:t>
       </w:r>
       <w:r>
         <w:rPr>
@@ -796,97 +852,716 @@
           <w:sz w:val="24"/>
           <w:szCs w:val="24"/>
         </w:rPr>
-        <w:t xml:space="preserve">predictive </w:t>
-      </w:r>
-      <w:r>
-        <w:rPr>
-          <w:rFonts w:ascii="Calibri" w:hAnsi="Calibri" w:cs="Calibri"/>
-          <w:b/>
+        <w:t>predictive models</w:t>
+      </w:r>
+      <w:r>
+        <w:rPr>
+          <w:rFonts w:ascii="Calibri" w:hAnsi="Calibri" w:cs="Calibri"/>
+          <w:sz w:val="24"/>
+          <w:szCs w:val="24"/>
+        </w:rPr>
+        <w:t xml:space="preserve">. These models are used to </w:t>
+      </w:r>
+      <w:r>
+        <w:rPr>
+          <w:rFonts w:ascii="Calibri" w:hAnsi="Calibri" w:cs="Calibri"/>
+          <w:b/>
+          <w:sz w:val="24"/>
+          <w:szCs w:val="24"/>
+        </w:rPr>
+        <w:t>analyze data, detect patterns, and make decisions</w:t>
+      </w:r>
+      <w:r>
+        <w:rPr>
+          <w:rFonts w:ascii="Calibri" w:hAnsi="Calibri" w:cs="Calibri"/>
+          <w:sz w:val="24"/>
+          <w:szCs w:val="24"/>
+        </w:rPr>
+        <w:t xml:space="preserve"> without relying on e</w:t>
+      </w:r>
+      <w:r>
+        <w:rPr>
+          <w:rFonts w:ascii="Calibri" w:hAnsi="Calibri" w:cs="Calibri"/>
+          <w:sz w:val="24"/>
+          <w:szCs w:val="24"/>
+        </w:rPr>
+        <w:t>xplicit programming.</w:t>
+      </w:r>
+    </w:p>
+    <w:p>
+      <w:pPr>
+        <w:rPr>
+          <w:rFonts w:ascii="Calibri" w:hAnsi="Calibri" w:cs="Calibri"/>
+          <w:sz w:val="24"/>
+          <w:szCs w:val="24"/>
+        </w:rPr>
+      </w:pPr>
+    </w:p>
+    <w:p>
+      <w:pPr>
+        <w:rPr>
+          <w:rFonts w:ascii="Calibri" w:hAnsi="Calibri" w:cs="Calibri"/>
+          <w:sz w:val="24"/>
+          <w:szCs w:val="24"/>
+        </w:rPr>
+      </w:pPr>
+      <w:r>
+        <w:rPr>
+          <w:rFonts w:ascii="Calibri" w:hAnsi="Calibri" w:cs="Calibri"/>
+          <w:sz w:val="24"/>
+          <w:szCs w:val="24"/>
+        </w:rPr>
+        <w:t>Machine learning has become increasingly popular in recent years as a way to improve the accuracy of data-driven decisions. At the core of machine learning is the idea that data can be used to generate predictions. In essence, machine learning is the process of training a computer to use existing data to make predictions about new data. This is done by finding patterns in existing data and using those patterns to make predictions about new data. The process of machine learning involves three main steps: data gathering, dat</w:t>
+      </w:r>
+      <w:r>
+        <w:rPr>
+          <w:rFonts w:ascii="Calibri" w:hAnsi="Calibri" w:cs="Calibri"/>
+          <w:sz w:val="24"/>
+          <w:szCs w:val="24"/>
+        </w:rPr>
+        <w:t>a analysis, and model building.</w:t>
+      </w:r>
+    </w:p>
+    <w:p>
+      <w:pPr>
+        <w:rPr>
+          <w:rFonts w:ascii="Calibri" w:hAnsi="Calibri" w:cs="Calibri"/>
+          <w:sz w:val="24"/>
+          <w:szCs w:val="24"/>
+        </w:rPr>
+      </w:pPr>
+    </w:p>
+    <w:p>
+      <w:pPr>
+        <w:rPr>
+          <w:rFonts w:ascii="Calibri" w:hAnsi="Calibri" w:cs="Calibri"/>
+          <w:b/>
+          <w:i/>
+          <w:sz w:val="24"/>
+          <w:szCs w:val="24"/>
+          <w:lang w:val="en-US"/>
+        </w:rPr>
+      </w:pPr>
+      <w:r>
+        <w:rPr>
+          <w:rFonts w:ascii="Calibri" w:hAnsi="Calibri" w:cs="Calibri"/>
+          <w:b/>
+          <w:i/>
+          <w:sz w:val="24"/>
+          <w:szCs w:val="24"/>
+          <w:lang w:val="en-US"/>
+        </w:rPr>
+        <w:t>Part 3</w:t>
+      </w:r>
+      <w:r>
+        <w:rPr>
+          <w:rFonts w:ascii="Calibri" w:hAnsi="Calibri" w:cs="Calibri"/>
+          <w:b/>
+          <w:i/>
+          <w:sz w:val="24"/>
+          <w:szCs w:val="24"/>
+          <w:lang w:val="en-US"/>
+        </w:rPr>
+        <w:t xml:space="preserve"> (</w:t>
+      </w:r>
+      <w:r>
+        <w:rPr>
+          <w:rFonts w:ascii="Calibri" w:hAnsi="Calibri" w:cs="Calibri"/>
+          <w:b/>
+          <w:i/>
+          <w:sz w:val="24"/>
+          <w:szCs w:val="24"/>
+        </w:rPr>
+        <w:t>Data gathering</w:t>
+      </w:r>
+      <w:r>
+        <w:rPr>
+          <w:rFonts w:ascii="Calibri" w:hAnsi="Calibri" w:cs="Calibri"/>
+          <w:b/>
+          <w:i/>
+          <w:sz w:val="24"/>
+          <w:szCs w:val="24"/>
+          <w:lang w:val="en-US"/>
+        </w:rPr>
+        <w:t>)</w:t>
+      </w:r>
+      <w:r>
+        <w:rPr>
+          <w:rFonts w:ascii="Calibri" w:hAnsi="Calibri" w:cs="Calibri"/>
+          <w:b/>
+          <w:i/>
+          <w:sz w:val="24"/>
+          <w:szCs w:val="24"/>
+          <w:lang w:val="en-US"/>
+        </w:rPr>
+        <w:t>:</w:t>
+      </w:r>
+    </w:p>
+    <w:p>
+      <w:pPr>
+        <w:rPr>
+          <w:rFonts w:ascii="Calibri" w:hAnsi="Calibri" w:cs="Calibri"/>
+          <w:sz w:val="24"/>
+          <w:szCs w:val="24"/>
+        </w:rPr>
+      </w:pPr>
+      <w:r>
+        <w:rPr>
+          <w:rFonts w:ascii="Calibri" w:hAnsi="Calibri" w:cs="Calibri"/>
+          <w:b/>
+          <w:sz w:val="24"/>
+          <w:szCs w:val="24"/>
+        </w:rPr>
+        <w:t>Data gathering</w:t>
+      </w:r>
+      <w:r>
+        <w:rPr>
+          <w:rFonts w:ascii="Calibri" w:hAnsi="Calibri" w:cs="Calibri"/>
+          <w:sz w:val="24"/>
+          <w:szCs w:val="24"/>
+        </w:rPr>
+        <w:t xml:space="preserve"> is the process of collecting data from various sources. This can include data from databases, web APIs, text documents, and even images. Once the data is collected, it is then preprocessed for analysis. This involves cleaning, normalizing, and selecting the important features. Data analysis is the process of using various techniques to analyze the data and identify patterns in it. Common techniques used in data analysis include </w:t>
+      </w:r>
+      <w:r>
+        <w:rPr>
+          <w:rFonts w:ascii="Calibri" w:hAnsi="Calibri" w:cs="Calibri"/>
+          <w:b/>
+          <w:sz w:val="24"/>
+          <w:szCs w:val="24"/>
+        </w:rPr>
+        <w:t>clustering, regression, and classification</w:t>
+      </w:r>
+      <w:r>
+        <w:rPr>
+          <w:rFonts w:ascii="Calibri" w:hAnsi="Calibri" w:cs="Calibri"/>
+          <w:sz w:val="24"/>
+          <w:szCs w:val="24"/>
+        </w:rPr>
+        <w:t>.</w:t>
+      </w:r>
+    </w:p>
+    <w:p>
+      <w:pPr>
+        <w:rPr>
+          <w:rFonts w:ascii="Calibri" w:hAnsi="Calibri" w:cs="Calibri"/>
+          <w:sz w:val="24"/>
+          <w:szCs w:val="24"/>
+        </w:rPr>
+      </w:pPr>
+    </w:p>
+    <w:p>
+      <w:pPr>
+        <w:rPr>
+          <w:rFonts w:ascii="Calibri" w:hAnsi="Calibri" w:cs="Calibri"/>
+          <w:sz w:val="24"/>
+          <w:szCs w:val="24"/>
+        </w:rPr>
+      </w:pPr>
+      <w:r>
+        <w:rPr>
+          <w:rFonts w:ascii="Calibri" w:hAnsi="Calibri" w:cs="Calibri"/>
+          <w:b/>
+          <w:sz w:val="24"/>
+          <w:szCs w:val="24"/>
+        </w:rPr>
+        <w:t>Clustering</w:t>
+      </w:r>
+      <w:r>
+        <w:rPr>
+          <w:rFonts w:ascii="Calibri" w:hAnsi="Calibri" w:cs="Calibri"/>
+          <w:sz w:val="24"/>
+          <w:szCs w:val="24"/>
+        </w:rPr>
+        <w:t xml:space="preserve"> is used to identify clusters or groups of data points </w:t>
+      </w:r>
+      <w:r>
+        <w:rPr>
+          <w:rFonts w:ascii="Calibri" w:hAnsi="Calibri" w:cs="Calibri"/>
+          <w:sz w:val="24"/>
+          <w:szCs w:val="24"/>
+        </w:rPr>
+        <w:t>that are related to each other.</w:t>
+      </w:r>
+    </w:p>
+    <w:p>
+      <w:pPr>
+        <w:rPr>
+          <w:rFonts w:ascii="Calibri" w:hAnsi="Calibri" w:cs="Calibri"/>
+          <w:sz w:val="24"/>
+          <w:szCs w:val="24"/>
+        </w:rPr>
+      </w:pPr>
+    </w:p>
+    <w:p>
+      <w:pPr>
+        <w:rPr>
+          <w:rFonts w:ascii="Calibri" w:hAnsi="Calibri" w:cs="Calibri"/>
+          <w:sz w:val="24"/>
+          <w:szCs w:val="24"/>
+        </w:rPr>
+      </w:pPr>
+      <w:r>
+        <w:rPr>
+          <w:rFonts w:ascii="Calibri" w:hAnsi="Calibri" w:cs="Calibri"/>
+          <w:b/>
+          <w:sz w:val="24"/>
+          <w:szCs w:val="24"/>
+        </w:rPr>
+        <w:t>Regression</w:t>
+      </w:r>
+      <w:r>
+        <w:rPr>
+          <w:rFonts w:ascii="Calibri" w:hAnsi="Calibri" w:cs="Calibri"/>
+          <w:sz w:val="24"/>
+          <w:szCs w:val="24"/>
+        </w:rPr>
+        <w:t xml:space="preserve"> is used to identify relationships between d</w:t>
+      </w:r>
+      <w:r>
+        <w:rPr>
+          <w:rFonts w:ascii="Calibri" w:hAnsi="Calibri" w:cs="Calibri"/>
+          <w:sz w:val="24"/>
+          <w:szCs w:val="24"/>
+        </w:rPr>
+        <w:t>ifferent variables in the data.</w:t>
+      </w:r>
+    </w:p>
+    <w:p>
+      <w:pPr>
+        <w:rPr>
+          <w:rFonts w:ascii="Calibri" w:hAnsi="Calibri" w:cs="Calibri"/>
+          <w:sz w:val="24"/>
+          <w:szCs w:val="24"/>
+        </w:rPr>
+      </w:pPr>
+    </w:p>
+    <w:p>
+      <w:pPr>
+        <w:rPr>
+          <w:rFonts w:ascii="Calibri" w:hAnsi="Calibri" w:cs="Calibri"/>
+          <w:sz w:val="24"/>
+          <w:szCs w:val="24"/>
+        </w:rPr>
+      </w:pPr>
+      <w:r>
+        <w:rPr>
+          <w:rFonts w:ascii="Calibri" w:hAnsi="Calibri" w:cs="Calibri"/>
+          <w:b/>
+          <w:sz w:val="24"/>
+          <w:szCs w:val="24"/>
+        </w:rPr>
+        <w:t>Classification</w:t>
+      </w:r>
+      <w:r>
+        <w:rPr>
+          <w:rFonts w:ascii="Calibri" w:hAnsi="Calibri" w:cs="Calibri"/>
+          <w:sz w:val="24"/>
+          <w:szCs w:val="24"/>
+        </w:rPr>
+        <w:t xml:space="preserve"> is used to create models that can accurately predict the class of a new data point. The final step in machine learning is model building. This involves using the patterns identified in the data to build a predictive model. Many different algorithms can be used to create these models, including </w:t>
+      </w:r>
+      <w:r>
+        <w:rPr>
+          <w:rFonts w:ascii="Calibri" w:hAnsi="Calibri" w:cs="Calibri"/>
+          <w:b/>
+          <w:sz w:val="24"/>
+          <w:szCs w:val="24"/>
+        </w:rPr>
+        <w:t>decision trees, support vector machines, and neural networks</w:t>
+      </w:r>
+      <w:r>
+        <w:rPr>
+          <w:rFonts w:ascii="Calibri" w:hAnsi="Calibri" w:cs="Calibri"/>
+          <w:sz w:val="24"/>
+          <w:szCs w:val="24"/>
+        </w:rPr>
+        <w:t>. The goal of model building is to find the most accurate and efficien</w:t>
+      </w:r>
+      <w:r>
+        <w:rPr>
+          <w:rFonts w:ascii="Calibri" w:hAnsi="Calibri" w:cs="Calibri"/>
+          <w:sz w:val="24"/>
+          <w:szCs w:val="24"/>
+        </w:rPr>
+        <w:t>t model for making predictions.</w:t>
+      </w:r>
+    </w:p>
+    <w:p>
+      <w:pPr>
+        <w:rPr>
+          <w:rFonts w:ascii="Calibri" w:hAnsi="Calibri" w:cs="Calibri"/>
+          <w:sz w:val="24"/>
+          <w:szCs w:val="24"/>
+        </w:rPr>
+      </w:pPr>
+    </w:p>
+    <w:p>
+      <w:pPr>
+        <w:rPr>
+          <w:rFonts w:ascii="Calibri" w:hAnsi="Calibri" w:cs="Calibri"/>
+          <w:sz w:val="24"/>
+          <w:szCs w:val="24"/>
+        </w:rPr>
+      </w:pPr>
+      <w:r>
+        <w:rPr>
+          <w:rFonts w:ascii="Calibri" w:hAnsi="Calibri" w:cs="Calibri"/>
+          <w:sz w:val="24"/>
+          <w:szCs w:val="24"/>
+        </w:rPr>
+        <w:t xml:space="preserve">Machine learning has become increasingly popular in the past few years due to its ability to quickly and accurately make data-driven decisions. It is used in a variety of fields, from </w:t>
+      </w:r>
+      <w:r>
+        <w:rPr>
+          <w:rFonts w:ascii="Calibri" w:hAnsi="Calibri" w:cs="Calibri"/>
+          <w:b/>
+          <w:sz w:val="24"/>
+          <w:szCs w:val="24"/>
+        </w:rPr>
+        <w:t>medical diagnosis to financial forecasting</w:t>
+      </w:r>
+      <w:r>
+        <w:rPr>
+          <w:rFonts w:ascii="Calibri" w:hAnsi="Calibri" w:cs="Calibri"/>
+          <w:sz w:val="24"/>
+          <w:szCs w:val="24"/>
+        </w:rPr>
+        <w:t>. The use of machine learning is constantly evolving as new algorithms and techniques are developed and improved.</w:t>
+      </w:r>
+    </w:p>
+    <w:p>
+      <w:pPr>
+        <w:rPr>
+          <w:rFonts w:ascii="Calibri" w:hAnsi="Calibri" w:cs="Calibri"/>
+          <w:sz w:val="24"/>
+          <w:szCs w:val="24"/>
+        </w:rPr>
+      </w:pPr>
+    </w:p>
+    <w:p>
+      <w:pPr>
+        <w:rPr>
+          <w:rFonts w:ascii="Calibri" w:hAnsi="Calibri" w:cs="Calibri"/>
+          <w:b/>
+          <w:i/>
+          <w:sz w:val="24"/>
+          <w:szCs w:val="24"/>
+          <w:lang w:val="en-US"/>
+        </w:rPr>
+      </w:pPr>
+      <w:r>
+        <w:rPr>
+          <w:rFonts w:ascii="Calibri" w:hAnsi="Calibri" w:cs="Calibri"/>
+          <w:b/>
+          <w:i/>
+          <w:sz w:val="24"/>
+          <w:szCs w:val="24"/>
+          <w:lang w:val="en-US"/>
+        </w:rPr>
+        <w:t>Part 4</w:t>
+      </w:r>
+      <w:r>
+        <w:rPr>
+          <w:rFonts w:ascii="Calibri" w:hAnsi="Calibri" w:cs="Calibri"/>
+          <w:b/>
+          <w:i/>
+          <w:sz w:val="24"/>
+          <w:szCs w:val="24"/>
+          <w:lang w:val="en-US"/>
+        </w:rPr>
+        <w:t xml:space="preserve"> (</w:t>
+      </w:r>
+      <w:r>
+        <w:rPr>
+          <w:rFonts w:ascii="Calibri" w:hAnsi="Calibri" w:cs="Calibri"/>
+          <w:b/>
+          <w:i/>
+          <w:sz w:val="24"/>
+          <w:szCs w:val="24"/>
+        </w:rPr>
+        <w:t>Reinforcement Learning</w:t>
+      </w:r>
+      <w:r>
+        <w:rPr>
+          <w:rFonts w:ascii="Calibri" w:hAnsi="Calibri" w:cs="Calibri"/>
+          <w:b/>
+          <w:i/>
+          <w:sz w:val="24"/>
+          <w:szCs w:val="24"/>
+          <w:lang w:val="en-US"/>
+        </w:rPr>
+        <w:t>)</w:t>
+      </w:r>
+      <w:r>
+        <w:rPr>
+          <w:rFonts w:ascii="Calibri" w:hAnsi="Calibri" w:cs="Calibri"/>
+          <w:b/>
+          <w:i/>
+          <w:sz w:val="24"/>
+          <w:szCs w:val="24"/>
+          <w:lang w:val="en-US"/>
+        </w:rPr>
+        <w:t>:</w:t>
+      </w:r>
+    </w:p>
+    <w:p>
+      <w:pPr>
+        <w:rPr>
+          <w:rFonts w:ascii="Calibri" w:hAnsi="Calibri" w:cs="Calibri"/>
+          <w:sz w:val="24"/>
+          <w:szCs w:val="24"/>
+        </w:rPr>
+      </w:pPr>
+      <w:r>
+        <w:rPr>
+          <w:rFonts w:ascii="Calibri" w:hAnsi="Calibri" w:cs="Calibri"/>
+          <w:b/>
+          <w:sz w:val="24"/>
+          <w:szCs w:val="24"/>
+        </w:rPr>
+        <w:t>Reinforcement Learning</w:t>
+      </w:r>
+      <w:r>
+        <w:rPr>
+          <w:rFonts w:ascii="Calibri" w:hAnsi="Calibri" w:cs="Calibri"/>
+          <w:sz w:val="24"/>
+          <w:szCs w:val="24"/>
+        </w:rPr>
+        <w:t xml:space="preserve"> (RL) is a type of AI that uses </w:t>
+      </w:r>
+      <w:r>
+        <w:rPr>
+          <w:rFonts w:ascii="Calibri" w:hAnsi="Calibri" w:cs="Calibri"/>
+          <w:b/>
+          <w:sz w:val="24"/>
+          <w:szCs w:val="24"/>
+        </w:rPr>
+        <w:t>rewards and punishments</w:t>
+      </w:r>
+      <w:r>
+        <w:rPr>
+          <w:rFonts w:ascii="Calibri" w:hAnsi="Calibri" w:cs="Calibri"/>
+          <w:sz w:val="24"/>
+          <w:szCs w:val="24"/>
+        </w:rPr>
+        <w:t xml:space="preserve"> to teach the AI how to make decisions. WINTER uses RL to learn how to respond to user input, so that it can provide more</w:t>
+      </w:r>
+      <w:r>
+        <w:rPr>
+          <w:rFonts w:ascii="Calibri" w:hAnsi="Calibri" w:cs="Calibri"/>
+          <w:sz w:val="24"/>
+          <w:szCs w:val="24"/>
+        </w:rPr>
+        <w:t xml:space="preserve"> accurate and useful responses.</w:t>
+      </w:r>
+    </w:p>
+    <w:p>
+      <w:pPr>
+        <w:rPr>
+          <w:rFonts w:ascii="Calibri" w:hAnsi="Calibri" w:cs="Calibri"/>
+          <w:sz w:val="24"/>
+          <w:szCs w:val="24"/>
+        </w:rPr>
+      </w:pPr>
+    </w:p>
+    <w:p>
+      <w:pPr>
+        <w:rPr>
+          <w:rFonts w:ascii="Calibri" w:hAnsi="Calibri" w:cs="Calibri"/>
+          <w:sz w:val="24"/>
+          <w:szCs w:val="24"/>
+        </w:rPr>
+      </w:pPr>
+      <w:r>
+        <w:rPr>
+          <w:rFonts w:ascii="Calibri" w:hAnsi="Calibri" w:cs="Calibri"/>
+          <w:b/>
+          <w:sz w:val="24"/>
+          <w:szCs w:val="24"/>
+        </w:rPr>
+        <w:t>RL algorithms are also used to adjust the AI's responses depending on the user's feedback.</w:t>
+      </w:r>
+      <w:r>
+        <w:rPr>
+          <w:rFonts w:ascii="Calibri" w:hAnsi="Calibri" w:cs="Calibri"/>
+          <w:sz w:val="24"/>
+          <w:szCs w:val="24"/>
+        </w:rPr>
+        <w:t xml:space="preserve"> The combination of NLP, ML and RL allows WINTER to process large amounts of data </w:t>
+      </w:r>
+      <w:r>
+        <w:rPr>
+          <w:rFonts w:ascii="Calibri" w:hAnsi="Calibri" w:cs="Calibri"/>
+          <w:b/>
+          <w:sz w:val="24"/>
+          <w:szCs w:val="24"/>
+        </w:rPr>
+        <w:t>quickly and accurately</w:t>
+      </w:r>
+      <w:r>
+        <w:rPr>
+          <w:rFonts w:ascii="Calibri" w:hAnsi="Calibri" w:cs="Calibri"/>
+          <w:sz w:val="24"/>
+          <w:szCs w:val="24"/>
+        </w:rPr>
+        <w:t xml:space="preserve">. This allows it to provide more accurate and helpful answers to users, making it an invaluable tool for </w:t>
+      </w:r>
+      <w:r>
+        <w:rPr>
+          <w:rFonts w:ascii="Calibri" w:hAnsi="Calibri" w:cs="Calibri"/>
+          <w:b/>
+          <w:sz w:val="24"/>
+          <w:szCs w:val="24"/>
+        </w:rPr>
+        <w:t>businesses and organizations</w:t>
+      </w:r>
+      <w:r>
+        <w:rPr>
+          <w:rFonts w:ascii="Calibri" w:hAnsi="Calibri" w:cs="Calibri"/>
+          <w:sz w:val="24"/>
+          <w:szCs w:val="24"/>
+        </w:rPr>
+        <w:t xml:space="preserve">. WINTER </w:t>
+      </w:r>
+      <w:r>
+        <w:rPr>
+          <w:rFonts w:ascii="Calibri" w:hAnsi="Calibri" w:cs="Calibri"/>
+          <w:sz w:val="24"/>
+          <w:szCs w:val="24"/>
+        </w:rPr>
+        <w:t>can be</w:t>
+      </w:r>
+      <w:r>
+        <w:rPr>
+          <w:rFonts w:ascii="Calibri" w:hAnsi="Calibri" w:cs="Calibri"/>
+          <w:sz w:val="24"/>
+          <w:szCs w:val="24"/>
+        </w:rPr>
+        <w:t xml:space="preserve"> used in a variety of industries, including </w:t>
+      </w:r>
+      <w:r>
+        <w:rPr>
+          <w:rFonts w:ascii="Calibri" w:hAnsi="Calibri" w:cs="Calibri"/>
+          <w:b/>
+          <w:sz w:val="24"/>
+          <w:szCs w:val="24"/>
+        </w:rPr>
+        <w:t>healthcare, finance, and customer service</w:t>
+      </w:r>
+      <w:r>
+        <w:rPr>
+          <w:rFonts w:ascii="Calibri" w:hAnsi="Calibri" w:cs="Calibri"/>
+          <w:sz w:val="24"/>
+          <w:szCs w:val="24"/>
+        </w:rPr>
+        <w:t>. Its ability to quickly process large amounts of data and provide accurate responses makes it a valu</w:t>
+      </w:r>
+      <w:r>
+        <w:rPr>
+          <w:rFonts w:ascii="Calibri" w:hAnsi="Calibri" w:cs="Calibri"/>
+          <w:sz w:val="24"/>
+          <w:szCs w:val="24"/>
+        </w:rPr>
+        <w:t>able asset for many businesses.</w:t>
+      </w:r>
+    </w:p>
+    <w:p>
+      <w:pPr>
+        <w:rPr>
+          <w:rFonts w:ascii="Calibri" w:hAnsi="Calibri" w:cs="Calibri"/>
+          <w:sz w:val="24"/>
+          <w:szCs w:val="24"/>
+          <w:lang w:val="en-US"/>
+        </w:rPr>
+      </w:pPr>
+    </w:p>
+    <w:p>
+      <w:pPr>
+        <w:rPr>
+          <w:rFonts w:ascii="Calibri" w:hAnsi="Calibri" w:cs="Calibri"/>
+          <w:sz w:val="24"/>
+          <w:szCs w:val="24"/>
+        </w:rPr>
+      </w:pPr>
+      <w:r>
+        <w:rPr>
+          <w:rFonts w:ascii="Calibri" w:hAnsi="Calibri" w:cs="Calibri"/>
+          <w:sz w:val="24"/>
+          <w:szCs w:val="24"/>
+          <w:lang w:val="en-US"/>
+        </w:rPr>
+        <w:t xml:space="preserve">Basically, </w:t>
+      </w:r>
+      <w:r>
+        <w:rPr>
+          <w:rFonts w:ascii="Calibri" w:hAnsi="Calibri" w:cs="Calibri"/>
+          <w:sz w:val="24"/>
+          <w:szCs w:val="24"/>
+        </w:rPr>
+        <w:t>Reinforcement learning is a type of machine learning that enables agents to learn how to maximize their rewards in an environment through trial and error. It is a type of learning that enables agents to interact with their environment and take actions that will result in rewards. This type of learning has been used to solve a variety of problems,</w:t>
+      </w:r>
+      <w:r>
+        <w:rPr>
+          <w:rFonts w:ascii="Calibri" w:hAnsi="Calibri" w:cs="Calibri"/>
+          <w:sz w:val="24"/>
+          <w:szCs w:val="24"/>
+        </w:rPr>
+        <w:t xml:space="preserve"> from game playing to robotics.</w:t>
+      </w:r>
+    </w:p>
+    <w:p>
+      <w:pPr>
+        <w:rPr>
+          <w:rFonts w:ascii="Calibri" w:hAnsi="Calibri" w:cs="Calibri"/>
+          <w:sz w:val="24"/>
+          <w:szCs w:val="24"/>
+        </w:rPr>
+      </w:pPr>
+    </w:p>
+    <w:p>
+      <w:pPr>
+        <w:rPr>
+          <w:rFonts w:ascii="Calibri" w:hAnsi="Calibri" w:cs="Calibri"/>
+          <w:sz w:val="24"/>
+          <w:szCs w:val="24"/>
+        </w:rPr>
+      </w:pPr>
+      <w:r>
+        <w:rPr>
+          <w:rFonts w:ascii="Calibri" w:hAnsi="Calibri" w:cs="Calibri"/>
+          <w:sz w:val="24"/>
+          <w:szCs w:val="24"/>
+        </w:rPr>
+        <w:t xml:space="preserve">The main components of reinforcement learning are the environment, the agent, and the reward system. The environment is the physical or virtual space in which the agent interacts with the environment. The agent is the entity that takes actions and learns from its experiences. The reward system is the mechanism used to determine the rewards that the agent will receive for taking a certain action. The goal of reinforcement learning is to teach the agent to learn how to maximize its rewards over time. This is done by using a trial and error approach in which the </w:t>
+      </w:r>
+      <w:r>
+        <w:rPr>
+          <w:rFonts w:ascii="Calibri" w:hAnsi="Calibri" w:cs="Calibri"/>
           <w:sz w:val="24"/>
           <w:szCs w:val="24"/>
         </w:rPr>
         <w:lastRenderedPageBreak/>
-        <w:t>models</w:t>
-      </w:r>
-      <w:r>
-        <w:rPr>
-          <w:rFonts w:ascii="Calibri" w:hAnsi="Calibri" w:cs="Calibri"/>
-          <w:sz w:val="24"/>
-          <w:szCs w:val="24"/>
-        </w:rPr>
-        <w:t xml:space="preserve">. These models are used to </w:t>
-      </w:r>
-      <w:r>
-        <w:rPr>
-          <w:rFonts w:ascii="Calibri" w:hAnsi="Calibri" w:cs="Calibri"/>
-          <w:b/>
-          <w:sz w:val="24"/>
-          <w:szCs w:val="24"/>
-        </w:rPr>
-        <w:t>analyze data, detect patterns, and make decisions</w:t>
-      </w:r>
-      <w:r>
-        <w:rPr>
-          <w:rFonts w:ascii="Calibri" w:hAnsi="Calibri" w:cs="Calibri"/>
-          <w:sz w:val="24"/>
-          <w:szCs w:val="24"/>
-        </w:rPr>
-        <w:t xml:space="preserve"> without relying on e</w:t>
-      </w:r>
-      <w:r>
-        <w:rPr>
-          <w:rFonts w:ascii="Calibri" w:hAnsi="Calibri" w:cs="Calibri"/>
-          <w:sz w:val="24"/>
-          <w:szCs w:val="24"/>
-        </w:rPr>
-        <w:t>xplicit programming.</w:t>
-      </w:r>
-    </w:p>
-    <w:p>
-      <w:pPr>
-        <w:rPr>
-          <w:rFonts w:ascii="Calibri" w:hAnsi="Calibri" w:cs="Calibri"/>
-          <w:sz w:val="24"/>
-          <w:szCs w:val="24"/>
-        </w:rPr>
-      </w:pPr>
-    </w:p>
-    <w:p>
-      <w:pPr>
-        <w:rPr>
-          <w:rFonts w:ascii="Calibri" w:hAnsi="Calibri" w:cs="Calibri"/>
-          <w:sz w:val="24"/>
-          <w:szCs w:val="24"/>
-        </w:rPr>
-      </w:pPr>
-      <w:r>
-        <w:rPr>
-          <w:rFonts w:ascii="Calibri" w:hAnsi="Calibri" w:cs="Calibri"/>
-          <w:sz w:val="24"/>
-          <w:szCs w:val="24"/>
-        </w:rPr>
-        <w:t>Machine learning has become increasingly popular in recent years as a way to improve the accuracy of data-driven decisions. At the core of machine learning is the idea that data can be used to generate predictions. In essence, machine learning is the process of training a computer to use existing data to make predictions about new data. This is done by finding patterns in existing data and using those patterns to make predictions about new data. The process of machine learning involves three main steps: data gathering, dat</w:t>
-      </w:r>
-      <w:r>
-        <w:rPr>
-          <w:rFonts w:ascii="Calibri" w:hAnsi="Calibri" w:cs="Calibri"/>
-          <w:sz w:val="24"/>
-          <w:szCs w:val="24"/>
-        </w:rPr>
-        <w:t>a analysis, and model building.</w:t>
-      </w:r>
-    </w:p>
-    <w:p>
-      <w:pPr>
-        <w:rPr>
-          <w:rFonts w:ascii="Calibri" w:hAnsi="Calibri" w:cs="Calibri"/>
-          <w:sz w:val="24"/>
-          <w:szCs w:val="24"/>
-        </w:rPr>
-      </w:pPr>
-    </w:p>
-    <w:p>
-      <w:pPr>
+        <w:t>agent takes an action and then receives feedback in the form of a reward. The agent then adjusts its strategies and actions according to the rewards it receives. Reinforcement learning is used in a variety of applications. It has been used in robotics to teach robots how to move in an environment, in game playing to learn how to win, and in natural language processing to learn how to respond to commands. It has also been used in the field of finance to optimize the trading strategies of banks and other financial institutions. Reinforcement learning has several advantages over other types of learning. First, it is able to learn from its mistakes and adjust its strategies and actions accordingly. Second, it can learn without any prior knowledge of the environment, allowing it to be used in new environments. Finally, it is able to learn quickly and efficiently, allowing it to adapt to changing situations. Reinforcement learning has many potential applications and is likely to continue to be an important tool in the development of intelligent agents and robots. It is also likely to be used in a wide range of other fields, from healthcare and finance to natural language processing.</w:t>
+      </w:r>
+    </w:p>
+    <w:p>
+      <w:pPr>
+        <w:rPr>
+          <w:rFonts w:ascii="Calibri" w:hAnsi="Calibri" w:cs="Calibri"/>
+          <w:sz w:val="24"/>
+          <w:szCs w:val="24"/>
+        </w:rPr>
+      </w:pPr>
+    </w:p>
+    <w:p>
+      <w:pPr>
+        <w:rPr>
+          <w:rFonts w:ascii="Calibri" w:hAnsi="Calibri" w:cs="Calibri"/>
+          <w:sz w:val="24"/>
+          <w:szCs w:val="24"/>
+        </w:rPr>
+      </w:pPr>
+      <w:r>
         <w:rPr>
           <w:rFonts w:ascii="Calibri" w:hAnsi="Calibri" w:cs="Calibri"/>
           <w:b/>
@@ -895,7 +1570,8 @@
           <w:szCs w:val="24"/>
           <w:lang w:val="en-US"/>
         </w:rPr>
-      </w:pPr>
+        <w:t>Part 5</w:t>
+      </w:r>
       <w:r>
         <w:rPr>
           <w:rFonts w:ascii="Calibri" w:hAnsi="Calibri" w:cs="Calibri"/>
@@ -905,7 +1581,7 @@
           <w:szCs w:val="24"/>
           <w:lang w:val="en-US"/>
         </w:rPr>
-        <w:t>Part 3</w:t>
+        <w:t xml:space="preserve"> (Neural networks)</w:t>
       </w:r>
       <w:r>
         <w:rPr>
@@ -916,38 +1592,6 @@
           <w:szCs w:val="24"/>
           <w:lang w:val="en-US"/>
         </w:rPr>
-        <w:t xml:space="preserve"> (</w:t>
-      </w:r>
-      <w:r>
-        <w:rPr>
-          <w:rFonts w:ascii="Calibri" w:hAnsi="Calibri" w:cs="Calibri"/>
-          <w:b/>
-          <w:i/>
-          <w:sz w:val="24"/>
-          <w:szCs w:val="24"/>
-        </w:rPr>
-        <w:t>Data gathering</w:t>
-      </w:r>
-      <w:r>
-        <w:rPr>
-          <w:rFonts w:ascii="Calibri" w:hAnsi="Calibri" w:cs="Calibri"/>
-          <w:b/>
-          <w:i/>
-          <w:sz w:val="24"/>
-          <w:szCs w:val="24"/>
-          <w:lang w:val="en-US"/>
-        </w:rPr>
-        <w:t>)</w:t>
-      </w:r>
-      <w:r>
-        <w:rPr>
-          <w:rFonts w:ascii="Calibri" w:hAnsi="Calibri" w:cs="Calibri"/>
-          <w:b/>
-          <w:i/>
-          <w:sz w:val="24"/>
-          <w:szCs w:val="24"/>
-          <w:lang w:val="en-US"/>
-        </w:rPr>
         <w:t>:</w:t>
       </w:r>
     </w:p>
@@ -966,383 +1610,359 @@
           <w:sz w:val="24"/>
           <w:szCs w:val="24"/>
         </w:rPr>
-        <w:t>Data gathering</w:t>
-      </w:r>
-      <w:r>
-        <w:rPr>
-          <w:rFonts w:ascii="Calibri" w:hAnsi="Calibri" w:cs="Calibri"/>
-          <w:sz w:val="24"/>
-          <w:szCs w:val="24"/>
-        </w:rPr>
-        <w:t xml:space="preserve"> is the process of collecting data from various sources. This can include data from databases, web APIs, text documents, and even images. Once the data is collected, it is then preprocessed for analysis. This involves cleaning, normalizing, and selecting the important features. Data analysis is the process of using various techniques to analyze the data and identify patterns in it. Common techniques used in data analysis include </w:t>
-      </w:r>
-      <w:r>
-        <w:rPr>
-          <w:rFonts w:ascii="Calibri" w:hAnsi="Calibri" w:cs="Calibri"/>
-          <w:b/>
-          <w:sz w:val="24"/>
-          <w:szCs w:val="24"/>
-        </w:rPr>
-        <w:t>clustering, regression, and classification</w:t>
-      </w:r>
-      <w:r>
-        <w:rPr>
-          <w:rFonts w:ascii="Calibri" w:hAnsi="Calibri" w:cs="Calibri"/>
-          <w:sz w:val="24"/>
-          <w:szCs w:val="24"/>
-        </w:rPr>
-        <w:t>.</w:t>
-      </w:r>
-    </w:p>
-    <w:p>
-      <w:pPr>
-        <w:rPr>
-          <w:rFonts w:ascii="Calibri" w:hAnsi="Calibri" w:cs="Calibri"/>
-          <w:sz w:val="24"/>
-          <w:szCs w:val="24"/>
-        </w:rPr>
-      </w:pPr>
-    </w:p>
-    <w:p>
-      <w:pPr>
-        <w:rPr>
-          <w:rFonts w:ascii="Calibri" w:hAnsi="Calibri" w:cs="Calibri"/>
-          <w:sz w:val="24"/>
-          <w:szCs w:val="24"/>
-        </w:rPr>
-      </w:pPr>
-      <w:r>
-        <w:rPr>
-          <w:rFonts w:ascii="Calibri" w:hAnsi="Calibri" w:cs="Calibri"/>
-          <w:b/>
-          <w:sz w:val="24"/>
-          <w:szCs w:val="24"/>
-        </w:rPr>
-        <w:t>Clustering</w:t>
-      </w:r>
-      <w:r>
-        <w:rPr>
-          <w:rFonts w:ascii="Calibri" w:hAnsi="Calibri" w:cs="Calibri"/>
-          <w:sz w:val="24"/>
-          <w:szCs w:val="24"/>
-        </w:rPr>
-        <w:t xml:space="preserve"> is used to identify clusters or groups of data points </w:t>
-      </w:r>
-      <w:r>
-        <w:rPr>
-          <w:rFonts w:ascii="Calibri" w:hAnsi="Calibri" w:cs="Calibri"/>
-          <w:sz w:val="24"/>
-          <w:szCs w:val="24"/>
-        </w:rPr>
-        <w:t>that are related to each other.</w:t>
-      </w:r>
-    </w:p>
-    <w:p>
-      <w:pPr>
-        <w:rPr>
-          <w:rFonts w:ascii="Calibri" w:hAnsi="Calibri" w:cs="Calibri"/>
-          <w:sz w:val="24"/>
-          <w:szCs w:val="24"/>
-        </w:rPr>
-      </w:pPr>
-    </w:p>
-    <w:p>
-      <w:pPr>
-        <w:rPr>
-          <w:rFonts w:ascii="Calibri" w:hAnsi="Calibri" w:cs="Calibri"/>
-          <w:sz w:val="24"/>
-          <w:szCs w:val="24"/>
-        </w:rPr>
-      </w:pPr>
-      <w:r>
-        <w:rPr>
-          <w:rFonts w:ascii="Calibri" w:hAnsi="Calibri" w:cs="Calibri"/>
-          <w:b/>
+        <w:t>Neural networks</w:t>
+      </w:r>
+      <w:r>
+        <w:rPr>
+          <w:rFonts w:ascii="Calibri" w:hAnsi="Calibri" w:cs="Calibri"/>
+          <w:sz w:val="24"/>
+          <w:szCs w:val="24"/>
+        </w:rPr>
+        <w:t xml:space="preserve"> are a type of machine learning algorithm </w:t>
+      </w:r>
+      <w:r>
+        <w:rPr>
+          <w:rFonts w:ascii="Calibri" w:hAnsi="Calibri" w:cs="Calibri"/>
+          <w:b/>
+          <w:sz w:val="24"/>
+          <w:szCs w:val="24"/>
+        </w:rPr>
+        <w:t>modeled after the human brain</w:t>
+      </w:r>
+      <w:r>
+        <w:rPr>
+          <w:rFonts w:ascii="Calibri" w:hAnsi="Calibri" w:cs="Calibri"/>
+          <w:sz w:val="24"/>
+          <w:szCs w:val="24"/>
+        </w:rPr>
+        <w:t xml:space="preserve">. They are composed of a large number of </w:t>
+      </w:r>
+      <w:r>
+        <w:rPr>
+          <w:rFonts w:ascii="Calibri" w:hAnsi="Calibri" w:cs="Calibri"/>
+          <w:b/>
+          <w:sz w:val="24"/>
+          <w:szCs w:val="24"/>
+        </w:rPr>
+        <w:t>interconnected nodes, or neurons</w:t>
+      </w:r>
+      <w:r>
+        <w:rPr>
+          <w:rFonts w:ascii="Calibri" w:hAnsi="Calibri" w:cs="Calibri"/>
+          <w:sz w:val="24"/>
+          <w:szCs w:val="24"/>
+        </w:rPr>
+        <w:t>, which process data and communicate with each other. The network is designed to learn from its inputs and produce an output tha</w:t>
+      </w:r>
+      <w:r>
+        <w:rPr>
+          <w:rFonts w:ascii="Calibri" w:hAnsi="Calibri" w:cs="Calibri"/>
+          <w:sz w:val="24"/>
+          <w:szCs w:val="24"/>
+        </w:rPr>
+        <w:t>t is predicted from the inputs.</w:t>
+      </w:r>
+    </w:p>
+    <w:p>
+      <w:pPr>
+        <w:rPr>
+          <w:rFonts w:ascii="Calibri" w:hAnsi="Calibri" w:cs="Calibri"/>
+          <w:sz w:val="24"/>
+          <w:szCs w:val="24"/>
+        </w:rPr>
+      </w:pPr>
+    </w:p>
+    <w:p>
+      <w:pPr>
+        <w:rPr>
+          <w:rFonts w:ascii="Calibri" w:hAnsi="Calibri" w:cs="Calibri"/>
+          <w:sz w:val="24"/>
+          <w:szCs w:val="24"/>
+        </w:rPr>
+      </w:pPr>
+      <w:r>
+        <w:rPr>
+          <w:rFonts w:ascii="Calibri" w:hAnsi="Calibri" w:cs="Calibri"/>
           <w:sz w:val="24"/>
           <w:szCs w:val="24"/>
         </w:rPr>
         <w:lastRenderedPageBreak/>
-        <w:t>Regression</w:t>
-      </w:r>
-      <w:r>
-        <w:rPr>
-          <w:rFonts w:ascii="Calibri" w:hAnsi="Calibri" w:cs="Calibri"/>
-          <w:sz w:val="24"/>
-          <w:szCs w:val="24"/>
-        </w:rPr>
-        <w:t xml:space="preserve"> is used to identify relationships between d</w:t>
-      </w:r>
-      <w:r>
-        <w:rPr>
-          <w:rFonts w:ascii="Calibri" w:hAnsi="Calibri" w:cs="Calibri"/>
-          <w:sz w:val="24"/>
-          <w:szCs w:val="24"/>
-        </w:rPr>
-        <w:t>ifferent variables in the data.</w:t>
-      </w:r>
-    </w:p>
-    <w:p>
-      <w:pPr>
-        <w:rPr>
-          <w:rFonts w:ascii="Calibri" w:hAnsi="Calibri" w:cs="Calibri"/>
-          <w:sz w:val="24"/>
-          <w:szCs w:val="24"/>
-        </w:rPr>
-      </w:pPr>
-    </w:p>
-    <w:p>
-      <w:pPr>
-        <w:rPr>
-          <w:rFonts w:ascii="Calibri" w:hAnsi="Calibri" w:cs="Calibri"/>
-          <w:sz w:val="24"/>
-          <w:szCs w:val="24"/>
-        </w:rPr>
-      </w:pPr>
-      <w:r>
-        <w:rPr>
-          <w:rFonts w:ascii="Calibri" w:hAnsi="Calibri" w:cs="Calibri"/>
-          <w:b/>
-          <w:sz w:val="24"/>
-          <w:szCs w:val="24"/>
-        </w:rPr>
-        <w:t>Classification</w:t>
-      </w:r>
-      <w:r>
-        <w:rPr>
-          <w:rFonts w:ascii="Calibri" w:hAnsi="Calibri" w:cs="Calibri"/>
-          <w:sz w:val="24"/>
-          <w:szCs w:val="24"/>
-        </w:rPr>
-        <w:t xml:space="preserve"> is used to create models that can accurately predict the class of a new data point. The final step in machine learning is model building. This involves using the patterns identified in the data to build a predictive model. Many different algorithms can be used to create these models, including </w:t>
-      </w:r>
-      <w:r>
-        <w:rPr>
-          <w:rFonts w:ascii="Calibri" w:hAnsi="Calibri" w:cs="Calibri"/>
-          <w:b/>
-          <w:sz w:val="24"/>
-          <w:szCs w:val="24"/>
-        </w:rPr>
-        <w:t>decision trees, support vector machines, and neural networks</w:t>
-      </w:r>
-      <w:r>
-        <w:rPr>
-          <w:rFonts w:ascii="Calibri" w:hAnsi="Calibri" w:cs="Calibri"/>
-          <w:sz w:val="24"/>
-          <w:szCs w:val="24"/>
-        </w:rPr>
-        <w:t>. The goal of model building is to find the most accurate and efficien</w:t>
-      </w:r>
-      <w:r>
-        <w:rPr>
-          <w:rFonts w:ascii="Calibri" w:hAnsi="Calibri" w:cs="Calibri"/>
-          <w:sz w:val="24"/>
-          <w:szCs w:val="24"/>
-        </w:rPr>
-        <w:t>t model for making predictions.</w:t>
-      </w:r>
-    </w:p>
-    <w:p>
-      <w:pPr>
-        <w:rPr>
-          <w:rFonts w:ascii="Calibri" w:hAnsi="Calibri" w:cs="Calibri"/>
-          <w:sz w:val="24"/>
-          <w:szCs w:val="24"/>
-        </w:rPr>
-      </w:pPr>
-    </w:p>
-    <w:p>
-      <w:pPr>
-        <w:rPr>
-          <w:rFonts w:ascii="Calibri" w:hAnsi="Calibri" w:cs="Calibri"/>
-          <w:sz w:val="24"/>
-          <w:szCs w:val="24"/>
-        </w:rPr>
-      </w:pPr>
-      <w:r>
-        <w:rPr>
-          <w:rFonts w:ascii="Calibri" w:hAnsi="Calibri" w:cs="Calibri"/>
-          <w:sz w:val="24"/>
-          <w:szCs w:val="24"/>
-        </w:rPr>
-        <w:t xml:space="preserve">Machine learning has become increasingly popular in the past few years due to its ability to quickly and accurately make data-driven decisions. It is used in a variety of fields, from </w:t>
-      </w:r>
-      <w:r>
-        <w:rPr>
-          <w:rFonts w:ascii="Calibri" w:hAnsi="Calibri" w:cs="Calibri"/>
-          <w:b/>
-          <w:sz w:val="24"/>
-          <w:szCs w:val="24"/>
-        </w:rPr>
-        <w:t>medical diagnosis to financial forecasting</w:t>
-      </w:r>
-      <w:r>
-        <w:rPr>
-          <w:rFonts w:ascii="Calibri" w:hAnsi="Calibri" w:cs="Calibri"/>
-          <w:sz w:val="24"/>
-          <w:szCs w:val="24"/>
-        </w:rPr>
-        <w:t>. The use of machine learning is constantly evolving as new algorithms and techniques are developed and improved.</w:t>
-      </w:r>
-    </w:p>
-    <w:p>
-      <w:pPr>
-        <w:rPr>
-          <w:rFonts w:ascii="Calibri" w:hAnsi="Calibri" w:cs="Calibri"/>
-          <w:sz w:val="24"/>
-          <w:szCs w:val="24"/>
-        </w:rPr>
-      </w:pPr>
-    </w:p>
-    <w:p>
-      <w:pPr>
-        <w:rPr>
-          <w:rFonts w:ascii="Calibri" w:hAnsi="Calibri" w:cs="Calibri"/>
-          <w:b/>
-          <w:i/>
-          <w:sz w:val="24"/>
-          <w:szCs w:val="24"/>
-          <w:lang w:val="en-US"/>
-        </w:rPr>
-      </w:pPr>
-      <w:r>
-        <w:rPr>
-          <w:rFonts w:ascii="Calibri" w:hAnsi="Calibri" w:cs="Calibri"/>
-          <w:b/>
-          <w:i/>
-          <w:sz w:val="24"/>
-          <w:szCs w:val="24"/>
-          <w:lang w:val="en-US"/>
-        </w:rPr>
-        <w:t>Part 4</w:t>
-      </w:r>
-      <w:r>
-        <w:rPr>
-          <w:rFonts w:ascii="Calibri" w:hAnsi="Calibri" w:cs="Calibri"/>
-          <w:b/>
-          <w:i/>
-          <w:sz w:val="24"/>
-          <w:szCs w:val="24"/>
-          <w:lang w:val="en-US"/>
-        </w:rPr>
-        <w:t xml:space="preserve"> (</w:t>
-      </w:r>
-      <w:r>
-        <w:rPr>
-          <w:rFonts w:ascii="Calibri" w:hAnsi="Calibri" w:cs="Calibri"/>
-          <w:b/>
-          <w:i/>
-          <w:sz w:val="24"/>
-          <w:szCs w:val="24"/>
-        </w:rPr>
-        <w:t>Reinforcement Learning</w:t>
-      </w:r>
-      <w:r>
-        <w:rPr>
-          <w:rFonts w:ascii="Calibri" w:hAnsi="Calibri" w:cs="Calibri"/>
-          <w:b/>
-          <w:i/>
-          <w:sz w:val="24"/>
-          <w:szCs w:val="24"/>
-          <w:lang w:val="en-US"/>
-        </w:rPr>
-        <w:t>)</w:t>
-      </w:r>
-      <w:r>
-        <w:rPr>
-          <w:rFonts w:ascii="Calibri" w:hAnsi="Calibri" w:cs="Calibri"/>
-          <w:b/>
-          <w:i/>
-          <w:sz w:val="24"/>
-          <w:szCs w:val="24"/>
-          <w:lang w:val="en-US"/>
-        </w:rPr>
-        <w:t>:</w:t>
-      </w:r>
-    </w:p>
-    <w:p>
-      <w:pPr>
-        <w:rPr>
-          <w:rFonts w:ascii="Calibri" w:hAnsi="Calibri" w:cs="Calibri"/>
-          <w:sz w:val="24"/>
-          <w:szCs w:val="24"/>
-        </w:rPr>
-      </w:pPr>
-      <w:r>
-        <w:rPr>
-          <w:rFonts w:ascii="Calibri" w:hAnsi="Calibri" w:cs="Calibri"/>
-          <w:b/>
-          <w:sz w:val="24"/>
-          <w:szCs w:val="24"/>
-        </w:rPr>
-        <w:t>Reinforcement Learning</w:t>
-      </w:r>
-      <w:r>
-        <w:rPr>
-          <w:rFonts w:ascii="Calibri" w:hAnsi="Calibri" w:cs="Calibri"/>
-          <w:sz w:val="24"/>
-          <w:szCs w:val="24"/>
-        </w:rPr>
-        <w:t xml:space="preserve"> (RL) is a type of AI that uses </w:t>
-      </w:r>
-      <w:r>
-        <w:rPr>
-          <w:rFonts w:ascii="Calibri" w:hAnsi="Calibri" w:cs="Calibri"/>
-          <w:b/>
-          <w:sz w:val="24"/>
-          <w:szCs w:val="24"/>
-        </w:rPr>
-        <w:t>rewards and punishments</w:t>
-      </w:r>
-      <w:r>
-        <w:rPr>
-          <w:rFonts w:ascii="Calibri" w:hAnsi="Calibri" w:cs="Calibri"/>
-          <w:sz w:val="24"/>
-          <w:szCs w:val="24"/>
-        </w:rPr>
-        <w:t xml:space="preserve"> to teach the AI how to make decisions. WINTER uses RL to learn how to respond to user input, so that it can provide more</w:t>
-      </w:r>
-      <w:r>
-        <w:rPr>
-          <w:rFonts w:ascii="Calibri" w:hAnsi="Calibri" w:cs="Calibri"/>
-          <w:sz w:val="24"/>
-          <w:szCs w:val="24"/>
-        </w:rPr>
-        <w:t xml:space="preserve"> accurate and useful responses.</w:t>
-      </w:r>
-    </w:p>
-    <w:p>
-      <w:pPr>
-        <w:rPr>
-          <w:rFonts w:ascii="Calibri" w:hAnsi="Calibri" w:cs="Calibri"/>
-          <w:sz w:val="24"/>
-          <w:szCs w:val="24"/>
-        </w:rPr>
-      </w:pPr>
-    </w:p>
-    <w:p>
-      <w:pPr>
-        <w:rPr>
-          <w:rFonts w:ascii="Calibri" w:hAnsi="Calibri" w:cs="Calibri"/>
-          <w:sz w:val="24"/>
-          <w:szCs w:val="24"/>
-        </w:rPr>
-      </w:pPr>
-      <w:r>
-        <w:rPr>
-          <w:rFonts w:ascii="Calibri" w:hAnsi="Calibri" w:cs="Calibri"/>
-          <w:b/>
-          <w:sz w:val="24"/>
-          <w:szCs w:val="24"/>
-        </w:rPr>
-        <w:t>RL algorithms are also used to adjust the AI's responses depending on the user's feedback.</w:t>
-      </w:r>
-      <w:r>
-        <w:rPr>
-          <w:rFonts w:ascii="Calibri" w:hAnsi="Calibri" w:cs="Calibri"/>
-          <w:sz w:val="24"/>
-          <w:szCs w:val="24"/>
-        </w:rPr>
-        <w:t xml:space="preserve"> The combination of NLP, ML and RL allows WINTER to process large </w:t>
+        <w:t xml:space="preserve">Neural networks are being used to solve a variety of tasks, from </w:t>
+      </w:r>
+      <w:r>
+        <w:rPr>
+          <w:rFonts w:ascii="Calibri" w:hAnsi="Calibri" w:cs="Calibri"/>
+          <w:b/>
+          <w:sz w:val="24"/>
+          <w:szCs w:val="24"/>
+        </w:rPr>
+        <w:t>computer vision</w:t>
+      </w:r>
+      <w:r>
+        <w:rPr>
+          <w:rFonts w:ascii="Calibri" w:hAnsi="Calibri" w:cs="Calibri"/>
+          <w:sz w:val="24"/>
+          <w:szCs w:val="24"/>
+        </w:rPr>
+        <w:t xml:space="preserve"> to </w:t>
+      </w:r>
+      <w:r>
+        <w:rPr>
+          <w:rFonts w:ascii="Calibri" w:hAnsi="Calibri" w:cs="Calibri"/>
+          <w:b/>
+          <w:sz w:val="24"/>
+          <w:szCs w:val="24"/>
+        </w:rPr>
+        <w:t>natural language processing</w:t>
+      </w:r>
+      <w:r>
+        <w:rPr>
+          <w:rFonts w:ascii="Calibri" w:hAnsi="Calibri" w:cs="Calibri"/>
+          <w:sz w:val="24"/>
+          <w:szCs w:val="24"/>
+        </w:rPr>
+        <w:t xml:space="preserve">. They are also being used to solve problems in </w:t>
+      </w:r>
+      <w:r>
+        <w:rPr>
+          <w:rFonts w:ascii="Calibri" w:hAnsi="Calibri" w:cs="Calibri"/>
+          <w:b/>
+          <w:sz w:val="24"/>
+          <w:szCs w:val="24"/>
+        </w:rPr>
+        <w:t>robotics, medicine, finance</w:t>
+      </w:r>
+      <w:r>
+        <w:rPr>
+          <w:rFonts w:ascii="Calibri" w:hAnsi="Calibri" w:cs="Calibri"/>
+          <w:sz w:val="24"/>
+          <w:szCs w:val="24"/>
+        </w:rPr>
+        <w:t>, and many other areas.</w:t>
+      </w:r>
+    </w:p>
+    <w:p>
+      <w:pPr>
+        <w:rPr>
+          <w:rFonts w:ascii="Calibri" w:hAnsi="Calibri" w:cs="Calibri"/>
+          <w:sz w:val="24"/>
+          <w:szCs w:val="24"/>
+        </w:rPr>
+      </w:pPr>
+    </w:p>
+    <w:p>
+      <w:pPr>
+        <w:rPr>
+          <w:rFonts w:ascii="Calibri" w:hAnsi="Calibri" w:cs="Calibri"/>
+          <w:sz w:val="24"/>
+          <w:szCs w:val="24"/>
+        </w:rPr>
+      </w:pPr>
+      <w:r>
+        <w:rPr>
+          <w:rFonts w:ascii="Calibri" w:hAnsi="Calibri" w:cs="Calibri"/>
+          <w:sz w:val="24"/>
+          <w:szCs w:val="24"/>
+        </w:rPr>
+        <w:t xml:space="preserve">Neural networks are composed of </w:t>
+      </w:r>
+      <w:r>
+        <w:rPr>
+          <w:rFonts w:ascii="Calibri" w:hAnsi="Calibri" w:cs="Calibri"/>
+          <w:b/>
+          <w:sz w:val="24"/>
+          <w:szCs w:val="24"/>
+        </w:rPr>
+        <w:t>multiple layers of neurons, or nodes</w:t>
+      </w:r>
+      <w:r>
+        <w:rPr>
+          <w:rFonts w:ascii="Calibri" w:hAnsi="Calibri" w:cs="Calibri"/>
+          <w:sz w:val="24"/>
+          <w:szCs w:val="24"/>
+        </w:rPr>
+        <w:t xml:space="preserve">. Each layer is responsible for a specific task, such as </w:t>
+      </w:r>
+      <w:r>
+        <w:rPr>
+          <w:rFonts w:ascii="Calibri" w:hAnsi="Calibri" w:cs="Calibri"/>
+          <w:b/>
+          <w:sz w:val="24"/>
+          <w:szCs w:val="24"/>
+        </w:rPr>
+        <w:t>feature extraction</w:t>
+      </w:r>
+      <w:r>
+        <w:rPr>
+          <w:rFonts w:ascii="Calibri" w:hAnsi="Calibri" w:cs="Calibri"/>
+          <w:sz w:val="24"/>
+          <w:szCs w:val="24"/>
+        </w:rPr>
+        <w:t xml:space="preserve"> or </w:t>
+      </w:r>
+      <w:r>
+        <w:rPr>
+          <w:rFonts w:ascii="Calibri" w:hAnsi="Calibri" w:cs="Calibri"/>
+          <w:b/>
+          <w:sz w:val="24"/>
+          <w:szCs w:val="24"/>
+        </w:rPr>
+        <w:t>classification</w:t>
+      </w:r>
+      <w:r>
+        <w:rPr>
+          <w:rFonts w:ascii="Calibri" w:hAnsi="Calibri" w:cs="Calibri"/>
+          <w:sz w:val="24"/>
+          <w:szCs w:val="24"/>
+        </w:rPr>
+        <w:t xml:space="preserve">. Connections between nodes in different layers are </w:t>
+      </w:r>
+      <w:r>
+        <w:rPr>
+          <w:rFonts w:ascii="Calibri" w:hAnsi="Calibri" w:cs="Calibri"/>
+          <w:b/>
+          <w:sz w:val="24"/>
+          <w:szCs w:val="24"/>
+        </w:rPr>
+        <w:t>weighted</w:t>
+      </w:r>
+      <w:r>
+        <w:rPr>
+          <w:rFonts w:ascii="Calibri" w:hAnsi="Calibri" w:cs="Calibri"/>
+          <w:sz w:val="24"/>
+          <w:szCs w:val="24"/>
+        </w:rPr>
+        <w:t xml:space="preserve">, meaning that the </w:t>
+      </w:r>
+      <w:r>
+        <w:rPr>
+          <w:rFonts w:ascii="Calibri" w:hAnsi="Calibri" w:cs="Calibri"/>
+          <w:b/>
+          <w:sz w:val="24"/>
+          <w:szCs w:val="24"/>
+        </w:rPr>
+        <w:t>strength of the connection between two nodes is determined by the value of the weights</w:t>
+      </w:r>
+      <w:r>
+        <w:rPr>
+          <w:rFonts w:ascii="Calibri" w:hAnsi="Calibri" w:cs="Calibri"/>
+          <w:sz w:val="24"/>
+          <w:szCs w:val="24"/>
+        </w:rPr>
+        <w:t xml:space="preserve">. </w:t>
+      </w:r>
+    </w:p>
+    <w:p>
+      <w:pPr>
+        <w:rPr>
+          <w:rFonts w:ascii="Calibri" w:hAnsi="Calibri" w:cs="Calibri"/>
+          <w:sz w:val="24"/>
+          <w:szCs w:val="24"/>
+        </w:rPr>
+      </w:pPr>
+      <w:r>
+        <w:rPr>
+          <w:rFonts w:ascii="Calibri" w:hAnsi="Calibri" w:cs="Calibri"/>
+          <w:sz w:val="24"/>
+          <w:szCs w:val="24"/>
+        </w:rPr>
+        <w:t xml:space="preserve">As the neural network is trained, the weights are adjusted so that the output is optimized. In order to train a neural network, a </w:t>
+      </w:r>
+      <w:r>
+        <w:rPr>
+          <w:rFonts w:ascii="Calibri" w:hAnsi="Calibri" w:cs="Calibri"/>
+          <w:b/>
+          <w:sz w:val="24"/>
+          <w:szCs w:val="24"/>
+        </w:rPr>
+        <w:t>dataset</w:t>
+      </w:r>
+      <w:r>
+        <w:rPr>
+          <w:rFonts w:ascii="Calibri" w:hAnsi="Calibri" w:cs="Calibri"/>
+          <w:sz w:val="24"/>
+          <w:szCs w:val="24"/>
+        </w:rPr>
+        <w:t xml:space="preserve"> is needed. This dataset is used to train the neural network so t</w:t>
+      </w:r>
+      <w:r>
+        <w:rPr>
+          <w:rFonts w:ascii="Calibri" w:hAnsi="Calibri" w:cs="Calibri"/>
+          <w:sz w:val="24"/>
+          <w:szCs w:val="24"/>
+        </w:rPr>
+        <w:t>hat it can learn from the data.</w:t>
+      </w:r>
+    </w:p>
+    <w:p>
+      <w:pPr>
+        <w:rPr>
+          <w:rFonts w:ascii="Calibri" w:hAnsi="Calibri" w:cs="Calibri"/>
+          <w:sz w:val="24"/>
+          <w:szCs w:val="24"/>
+        </w:rPr>
+      </w:pPr>
+    </w:p>
+    <w:p>
+      <w:pPr>
+        <w:rPr>
+          <w:rFonts w:ascii="Calibri" w:hAnsi="Calibri" w:cs="Calibri"/>
+          <w:b/>
+          <w:sz w:val="24"/>
+          <w:szCs w:val="24"/>
+        </w:rPr>
+      </w:pPr>
+      <w:r>
+        <w:rPr>
+          <w:rFonts w:ascii="Calibri" w:hAnsi="Calibri" w:cs="Calibri"/>
+          <w:b/>
+          <w:sz w:val="24"/>
+          <w:szCs w:val="24"/>
+        </w:rPr>
+        <w:t>The training process involves adjusting the weights so that the output of the neural network is as close as possible to the desired output.</w:t>
+      </w:r>
+    </w:p>
+    <w:p>
+      <w:pPr>
+        <w:rPr>
+          <w:rFonts w:ascii="Calibri" w:hAnsi="Calibri" w:cs="Calibri"/>
+          <w:sz w:val="24"/>
+          <w:szCs w:val="24"/>
+        </w:rPr>
+      </w:pPr>
+    </w:p>
+    <w:p>
+      <w:pPr>
+        <w:rPr>
+          <w:rFonts w:ascii="Calibri" w:hAnsi="Calibri" w:cs="Calibri"/>
+          <w:sz w:val="24"/>
+          <w:szCs w:val="24"/>
+        </w:rPr>
+      </w:pPr>
+      <w:r>
+        <w:rPr>
+          <w:rFonts w:ascii="Calibri" w:hAnsi="Calibri" w:cs="Calibri"/>
+          <w:sz w:val="24"/>
+          <w:szCs w:val="24"/>
+        </w:rPr>
+        <w:t xml:space="preserve">Neural networks have many advantages over traditional machine learning algorithms, such as being able to learn complex patterns in data. They are also able to generalize well, meaning that they can accurately classify new data that it has not seen before. The applications of neural networks are vast and growing. They are being used in a variety of fields, from </w:t>
+      </w:r>
+      <w:r>
+        <w:rPr>
+          <w:rFonts w:ascii="Calibri" w:hAnsi="Calibri" w:cs="Calibri"/>
+          <w:b/>
+          <w:sz w:val="24"/>
+          <w:szCs w:val="24"/>
+        </w:rPr>
+        <w:t>healthcare to finance</w:t>
+      </w:r>
+      <w:r>
+        <w:rPr>
+          <w:rFonts w:ascii="Calibri" w:hAnsi="Calibri" w:cs="Calibri"/>
+          <w:sz w:val="24"/>
+          <w:szCs w:val="24"/>
+        </w:rPr>
+        <w:t xml:space="preserve">. As research in this area progresses, it is likely that neural </w:t>
       </w:r>
       <w:r>
         <w:rPr>
@@ -1351,582 +1971,7 @@
           <w:szCs w:val="24"/>
         </w:rPr>
         <w:lastRenderedPageBreak/>
-        <w:t xml:space="preserve">amounts of data </w:t>
-      </w:r>
-      <w:r>
-        <w:rPr>
-          <w:rFonts w:ascii="Calibri" w:hAnsi="Calibri" w:cs="Calibri"/>
-          <w:b/>
-          <w:sz w:val="24"/>
-          <w:szCs w:val="24"/>
-        </w:rPr>
-        <w:t>quickly and accurately</w:t>
-      </w:r>
-      <w:r>
-        <w:rPr>
-          <w:rFonts w:ascii="Calibri" w:hAnsi="Calibri" w:cs="Calibri"/>
-          <w:sz w:val="24"/>
-          <w:szCs w:val="24"/>
-        </w:rPr>
-        <w:t xml:space="preserve">. This allows it to provide more accurate and helpful answers to users, making it an invaluable tool for </w:t>
-      </w:r>
-      <w:r>
-        <w:rPr>
-          <w:rFonts w:ascii="Calibri" w:hAnsi="Calibri" w:cs="Calibri"/>
-          <w:b/>
-          <w:sz w:val="24"/>
-          <w:szCs w:val="24"/>
-        </w:rPr>
-        <w:t>businesses and organizations</w:t>
-      </w:r>
-      <w:r>
-        <w:rPr>
-          <w:rFonts w:ascii="Calibri" w:hAnsi="Calibri" w:cs="Calibri"/>
-          <w:sz w:val="24"/>
-          <w:szCs w:val="24"/>
-        </w:rPr>
-        <w:t xml:space="preserve">. WINTER </w:t>
-      </w:r>
-      <w:r>
-        <w:rPr>
-          <w:rFonts w:ascii="Calibri" w:hAnsi="Calibri" w:cs="Calibri"/>
-          <w:sz w:val="24"/>
-          <w:szCs w:val="24"/>
-        </w:rPr>
-        <w:t>can be</w:t>
-      </w:r>
-      <w:r>
-        <w:rPr>
-          <w:rFonts w:ascii="Calibri" w:hAnsi="Calibri" w:cs="Calibri"/>
-          <w:sz w:val="24"/>
-          <w:szCs w:val="24"/>
-        </w:rPr>
-        <w:t xml:space="preserve"> used in a variety of industries, including </w:t>
-      </w:r>
-      <w:r>
-        <w:rPr>
-          <w:rFonts w:ascii="Calibri" w:hAnsi="Calibri" w:cs="Calibri"/>
-          <w:b/>
-          <w:sz w:val="24"/>
-          <w:szCs w:val="24"/>
-        </w:rPr>
-        <w:t>healthcare, finance, and customer service</w:t>
-      </w:r>
-      <w:r>
-        <w:rPr>
-          <w:rFonts w:ascii="Calibri" w:hAnsi="Calibri" w:cs="Calibri"/>
-          <w:sz w:val="24"/>
-          <w:szCs w:val="24"/>
-        </w:rPr>
-        <w:t>. Its ability to quickly process large amounts of data and provide accurate responses makes it a valu</w:t>
-      </w:r>
-      <w:r>
-        <w:rPr>
-          <w:rFonts w:ascii="Calibri" w:hAnsi="Calibri" w:cs="Calibri"/>
-          <w:sz w:val="24"/>
-          <w:szCs w:val="24"/>
-        </w:rPr>
-        <w:t>able asset for many businesses.</w:t>
-      </w:r>
-    </w:p>
-    <w:p>
-      <w:pPr>
-        <w:rPr>
-          <w:rFonts w:ascii="Calibri" w:hAnsi="Calibri" w:cs="Calibri"/>
-          <w:sz w:val="24"/>
-          <w:szCs w:val="24"/>
-          <w:lang w:val="en-US"/>
-        </w:rPr>
-      </w:pPr>
-    </w:p>
-    <w:p>
-      <w:pPr>
-        <w:rPr>
-          <w:rFonts w:ascii="Calibri" w:hAnsi="Calibri" w:cs="Calibri"/>
-          <w:sz w:val="24"/>
-          <w:szCs w:val="24"/>
-        </w:rPr>
-      </w:pPr>
-      <w:r>
-        <w:rPr>
-          <w:rFonts w:ascii="Calibri" w:hAnsi="Calibri" w:cs="Calibri"/>
-          <w:sz w:val="24"/>
-          <w:szCs w:val="24"/>
-          <w:lang w:val="en-US"/>
-        </w:rPr>
-        <w:t xml:space="preserve">Basically, </w:t>
-      </w:r>
-      <w:r>
-        <w:rPr>
-          <w:rFonts w:ascii="Calibri" w:hAnsi="Calibri" w:cs="Calibri"/>
-          <w:sz w:val="24"/>
-          <w:szCs w:val="24"/>
-        </w:rPr>
-        <w:t>Reinforcement learning is a type of machine learning that enables agents to learn how to maximize their rewards in an environment through trial and error. It is a type of learning that enables agents to interact with their environment and take actions that will result in rewards. This type of learning has been used to solve a variety of problems,</w:t>
-      </w:r>
-      <w:r>
-        <w:rPr>
-          <w:rFonts w:ascii="Calibri" w:hAnsi="Calibri" w:cs="Calibri"/>
-          <w:sz w:val="24"/>
-          <w:szCs w:val="24"/>
-        </w:rPr>
-        <w:t xml:space="preserve"> from game playing to robotics.</w:t>
-      </w:r>
-    </w:p>
-    <w:p>
-      <w:pPr>
-        <w:rPr>
-          <w:rFonts w:ascii="Calibri" w:hAnsi="Calibri" w:cs="Calibri"/>
-          <w:sz w:val="24"/>
-          <w:szCs w:val="24"/>
-        </w:rPr>
-      </w:pPr>
-    </w:p>
-    <w:p>
-      <w:pPr>
-        <w:rPr>
-          <w:rFonts w:ascii="Calibri" w:hAnsi="Calibri" w:cs="Calibri"/>
-          <w:sz w:val="24"/>
-          <w:szCs w:val="24"/>
-        </w:rPr>
-      </w:pPr>
-      <w:r>
-        <w:rPr>
-          <w:rFonts w:ascii="Calibri" w:hAnsi="Calibri" w:cs="Calibri"/>
-          <w:sz w:val="24"/>
-          <w:szCs w:val="24"/>
-        </w:rPr>
-        <w:t xml:space="preserve">The main components of reinforcement learning are the environment, the agent, and the reward system. The environment is the physical or virtual space in which the agent interacts with the environment. The agent is the entity that takes actions and learns from its experiences. The reward system is the mechanism used to determine the rewards that the agent will receive for taking a certain action. The goal of reinforcement learning is to teach the agent to learn how to maximize its rewards over time. This is done by using a trial and error approach in which the agent takes an action and then receives feedback in the form of a reward. The agent then adjusts its strategies and actions according to the rewards it receives. Reinforcement learning is used in a variety of applications. It has been </w:t>
-      </w:r>
-      <w:r>
-        <w:rPr>
-          <w:rFonts w:ascii="Calibri" w:hAnsi="Calibri" w:cs="Calibri"/>
-          <w:sz w:val="24"/>
-          <w:szCs w:val="24"/>
-        </w:rPr>
-        <w:lastRenderedPageBreak/>
-        <w:t>used in robotics to teach robots how to move in an environment, in game playing to learn how to win, and in natural language processing to learn how to respond to commands. It has also been used in the field of finance to optimize the trading strategies of banks and other financial institutions. Reinforcement learning has several advantages over other types of learning. First, it is able to learn from its mistakes and adjust its strategies and actions accordingly. Second, it can learn without any prior knowledge of the environment, allowing it to be used in new environments. Finally, it is able to learn quickly and efficiently, allowing it to adapt to changing situations. Reinforcement learning has many potential applications and is likely to continue to be an important tool in the development of intelligent agents and robots. It is also likely to be used in a wide range of other fields, from healthcare and finance to natural language processing.</w:t>
-      </w:r>
-    </w:p>
-    <w:p>
-      <w:pPr>
-        <w:rPr>
-          <w:rFonts w:ascii="Calibri" w:hAnsi="Calibri" w:cs="Calibri"/>
-          <w:sz w:val="24"/>
-          <w:szCs w:val="24"/>
-        </w:rPr>
-      </w:pPr>
-    </w:p>
-    <w:p>
-      <w:pPr>
-        <w:rPr>
-          <w:rFonts w:ascii="Calibri" w:hAnsi="Calibri" w:cs="Calibri"/>
-          <w:sz w:val="24"/>
-          <w:szCs w:val="24"/>
-        </w:rPr>
-      </w:pPr>
-      <w:r>
-        <w:rPr>
-          <w:rFonts w:ascii="Calibri" w:hAnsi="Calibri" w:cs="Calibri"/>
-          <w:b/>
-          <w:i/>
-          <w:sz w:val="24"/>
-          <w:szCs w:val="24"/>
-          <w:lang w:val="en-US"/>
-        </w:rPr>
-        <w:t>Part 5</w:t>
-      </w:r>
-      <w:r>
-        <w:rPr>
-          <w:rFonts w:ascii="Calibri" w:hAnsi="Calibri" w:cs="Calibri"/>
-          <w:b/>
-          <w:i/>
-          <w:sz w:val="24"/>
-          <w:szCs w:val="24"/>
-          <w:lang w:val="en-US"/>
-        </w:rPr>
-        <w:t xml:space="preserve"> (Neural networks)</w:t>
-      </w:r>
-      <w:r>
-        <w:rPr>
-          <w:rFonts w:ascii="Calibri" w:hAnsi="Calibri" w:cs="Calibri"/>
-          <w:b/>
-          <w:i/>
-          <w:sz w:val="24"/>
-          <w:szCs w:val="24"/>
-          <w:lang w:val="en-US"/>
-        </w:rPr>
-        <w:t>:</w:t>
-      </w:r>
-    </w:p>
-    <w:p>
-      <w:pPr>
-        <w:rPr>
-          <w:rFonts w:ascii="Calibri" w:hAnsi="Calibri" w:cs="Calibri"/>
-          <w:sz w:val="24"/>
-          <w:szCs w:val="24"/>
-        </w:rPr>
-      </w:pPr>
-      <w:r>
-        <w:rPr>
-          <w:rFonts w:ascii="Calibri" w:hAnsi="Calibri" w:cs="Calibri"/>
-          <w:b/>
-          <w:sz w:val="24"/>
-          <w:szCs w:val="24"/>
-        </w:rPr>
-        <w:t>Neural networks</w:t>
-      </w:r>
-      <w:r>
-        <w:rPr>
-          <w:rFonts w:ascii="Calibri" w:hAnsi="Calibri" w:cs="Calibri"/>
-          <w:sz w:val="24"/>
-          <w:szCs w:val="24"/>
-        </w:rPr>
-        <w:t xml:space="preserve"> are a type of machine learning algorithm </w:t>
-      </w:r>
-      <w:r>
-        <w:rPr>
-          <w:rFonts w:ascii="Calibri" w:hAnsi="Calibri" w:cs="Calibri"/>
-          <w:b/>
-          <w:sz w:val="24"/>
-          <w:szCs w:val="24"/>
-        </w:rPr>
-        <w:t>modeled after the human brain</w:t>
-      </w:r>
-      <w:r>
-        <w:rPr>
-          <w:rFonts w:ascii="Calibri" w:hAnsi="Calibri" w:cs="Calibri"/>
-          <w:sz w:val="24"/>
-          <w:szCs w:val="24"/>
-        </w:rPr>
-        <w:t xml:space="preserve">. They are composed of a large number of </w:t>
-      </w:r>
-      <w:r>
-        <w:rPr>
-          <w:rFonts w:ascii="Calibri" w:hAnsi="Calibri" w:cs="Calibri"/>
-          <w:b/>
-          <w:sz w:val="24"/>
-          <w:szCs w:val="24"/>
-        </w:rPr>
-        <w:t>interconnected nodes, or neurons</w:t>
-      </w:r>
-      <w:r>
-        <w:rPr>
-          <w:rFonts w:ascii="Calibri" w:hAnsi="Calibri" w:cs="Calibri"/>
-          <w:sz w:val="24"/>
-          <w:szCs w:val="24"/>
-        </w:rPr>
-        <w:t>, which process data and communicate with each other. The network is designed to learn from its inputs and produce an output tha</w:t>
-      </w:r>
-      <w:r>
-        <w:rPr>
-          <w:rFonts w:ascii="Calibri" w:hAnsi="Calibri" w:cs="Calibri"/>
-          <w:sz w:val="24"/>
-          <w:szCs w:val="24"/>
-        </w:rPr>
-        <w:t>t is predicted from the inputs.</w:t>
-      </w:r>
-    </w:p>
-    <w:p>
-      <w:pPr>
-        <w:rPr>
-          <w:rFonts w:ascii="Calibri" w:hAnsi="Calibri" w:cs="Calibri"/>
-          <w:sz w:val="24"/>
-          <w:szCs w:val="24"/>
-        </w:rPr>
-      </w:pPr>
-    </w:p>
-    <w:p>
-      <w:pPr>
-        <w:rPr>
-          <w:rFonts w:ascii="Calibri" w:hAnsi="Calibri" w:cs="Calibri"/>
-          <w:sz w:val="24"/>
-          <w:szCs w:val="24"/>
-        </w:rPr>
-      </w:pPr>
-      <w:r>
-        <w:rPr>
-          <w:rFonts w:ascii="Calibri" w:hAnsi="Calibri" w:cs="Calibri"/>
-          <w:sz w:val="24"/>
-          <w:szCs w:val="24"/>
-        </w:rPr>
-        <w:t xml:space="preserve">Neural networks are being used to solve a variety of tasks, from </w:t>
-      </w:r>
-      <w:r>
-        <w:rPr>
-          <w:rFonts w:ascii="Calibri" w:hAnsi="Calibri" w:cs="Calibri"/>
-          <w:b/>
-          <w:sz w:val="24"/>
-          <w:szCs w:val="24"/>
-        </w:rPr>
-        <w:t>computer vision</w:t>
-      </w:r>
-      <w:r>
-        <w:rPr>
-          <w:rFonts w:ascii="Calibri" w:hAnsi="Calibri" w:cs="Calibri"/>
-          <w:sz w:val="24"/>
-          <w:szCs w:val="24"/>
-        </w:rPr>
-        <w:t xml:space="preserve"> to </w:t>
-      </w:r>
-      <w:r>
-        <w:rPr>
-          <w:rFonts w:ascii="Calibri" w:hAnsi="Calibri" w:cs="Calibri"/>
-          <w:b/>
-          <w:sz w:val="24"/>
-          <w:szCs w:val="24"/>
-        </w:rPr>
-        <w:t>natural language processing</w:t>
-      </w:r>
-      <w:r>
-        <w:rPr>
-          <w:rFonts w:ascii="Calibri" w:hAnsi="Calibri" w:cs="Calibri"/>
-          <w:sz w:val="24"/>
-          <w:szCs w:val="24"/>
-        </w:rPr>
-        <w:t xml:space="preserve">. They are also being used to solve problems in </w:t>
-      </w:r>
-      <w:r>
-        <w:rPr>
-          <w:rFonts w:ascii="Calibri" w:hAnsi="Calibri" w:cs="Calibri"/>
-          <w:b/>
-          <w:sz w:val="24"/>
-          <w:szCs w:val="24"/>
-        </w:rPr>
-        <w:lastRenderedPageBreak/>
-        <w:t>robotics, medicine, finance</w:t>
-      </w:r>
-      <w:r>
-        <w:rPr>
-          <w:rFonts w:ascii="Calibri" w:hAnsi="Calibri" w:cs="Calibri"/>
-          <w:sz w:val="24"/>
-          <w:szCs w:val="24"/>
-        </w:rPr>
-        <w:t>, and many other areas.</w:t>
-      </w:r>
-    </w:p>
-    <w:p>
-      <w:pPr>
-        <w:rPr>
-          <w:rFonts w:ascii="Calibri" w:hAnsi="Calibri" w:cs="Calibri"/>
-          <w:sz w:val="24"/>
-          <w:szCs w:val="24"/>
-        </w:rPr>
-      </w:pPr>
-    </w:p>
-    <w:p>
-      <w:pPr>
-        <w:rPr>
-          <w:rFonts w:ascii="Calibri" w:hAnsi="Calibri" w:cs="Calibri"/>
-          <w:sz w:val="24"/>
-          <w:szCs w:val="24"/>
-        </w:rPr>
-      </w:pPr>
-      <w:r>
-        <w:rPr>
-          <w:rFonts w:ascii="Calibri" w:hAnsi="Calibri" w:cs="Calibri"/>
-          <w:sz w:val="24"/>
-          <w:szCs w:val="24"/>
-        </w:rPr>
-        <w:t xml:space="preserve">Neural networks are composed of </w:t>
-      </w:r>
-      <w:r>
-        <w:rPr>
-          <w:rFonts w:ascii="Calibri" w:hAnsi="Calibri" w:cs="Calibri"/>
-          <w:b/>
-          <w:sz w:val="24"/>
-          <w:szCs w:val="24"/>
-        </w:rPr>
-        <w:t>multiple layers of neurons, or nodes</w:t>
-      </w:r>
-      <w:r>
-        <w:rPr>
-          <w:rFonts w:ascii="Calibri" w:hAnsi="Calibri" w:cs="Calibri"/>
-          <w:sz w:val="24"/>
-          <w:szCs w:val="24"/>
-        </w:rPr>
-        <w:t xml:space="preserve">. Each layer is responsible for a specific task, such as </w:t>
-      </w:r>
-      <w:r>
-        <w:rPr>
-          <w:rFonts w:ascii="Calibri" w:hAnsi="Calibri" w:cs="Calibri"/>
-          <w:b/>
-          <w:sz w:val="24"/>
-          <w:szCs w:val="24"/>
-        </w:rPr>
-        <w:t>feature extraction</w:t>
-      </w:r>
-      <w:r>
-        <w:rPr>
-          <w:rFonts w:ascii="Calibri" w:hAnsi="Calibri" w:cs="Calibri"/>
-          <w:sz w:val="24"/>
-          <w:szCs w:val="24"/>
-        </w:rPr>
-        <w:t xml:space="preserve"> or </w:t>
-      </w:r>
-      <w:r>
-        <w:rPr>
-          <w:rFonts w:ascii="Calibri" w:hAnsi="Calibri" w:cs="Calibri"/>
-          <w:b/>
-          <w:sz w:val="24"/>
-          <w:szCs w:val="24"/>
-        </w:rPr>
-        <w:t>classification</w:t>
-      </w:r>
-      <w:r>
-        <w:rPr>
-          <w:rFonts w:ascii="Calibri" w:hAnsi="Calibri" w:cs="Calibri"/>
-          <w:sz w:val="24"/>
-          <w:szCs w:val="24"/>
-        </w:rPr>
-        <w:t xml:space="preserve">. Connections between nodes in different layers are </w:t>
-      </w:r>
-      <w:r>
-        <w:rPr>
-          <w:rFonts w:ascii="Calibri" w:hAnsi="Calibri" w:cs="Calibri"/>
-          <w:b/>
-          <w:sz w:val="24"/>
-          <w:szCs w:val="24"/>
-        </w:rPr>
-        <w:t>weighted</w:t>
-      </w:r>
-      <w:r>
-        <w:rPr>
-          <w:rFonts w:ascii="Calibri" w:hAnsi="Calibri" w:cs="Calibri"/>
-          <w:sz w:val="24"/>
-          <w:szCs w:val="24"/>
-        </w:rPr>
-        <w:t xml:space="preserve">, meaning that the </w:t>
-      </w:r>
-      <w:r>
-        <w:rPr>
-          <w:rFonts w:ascii="Calibri" w:hAnsi="Calibri" w:cs="Calibri"/>
-          <w:b/>
-          <w:sz w:val="24"/>
-          <w:szCs w:val="24"/>
-        </w:rPr>
-        <w:t>strength of the connection between two nodes is determined by the value of the weights</w:t>
-      </w:r>
-      <w:r>
-        <w:rPr>
-          <w:rFonts w:ascii="Calibri" w:hAnsi="Calibri" w:cs="Calibri"/>
-          <w:sz w:val="24"/>
-          <w:szCs w:val="24"/>
-        </w:rPr>
-        <w:t xml:space="preserve">. </w:t>
-      </w:r>
-    </w:p>
-    <w:p>
-      <w:pPr>
-        <w:rPr>
-          <w:rFonts w:ascii="Calibri" w:hAnsi="Calibri" w:cs="Calibri"/>
-          <w:sz w:val="24"/>
-          <w:szCs w:val="24"/>
-        </w:rPr>
-      </w:pPr>
-      <w:r>
-        <w:rPr>
-          <w:rFonts w:ascii="Calibri" w:hAnsi="Calibri" w:cs="Calibri"/>
-          <w:sz w:val="24"/>
-          <w:szCs w:val="24"/>
-        </w:rPr>
-        <w:t xml:space="preserve">As the neural network is trained, the weights are adjusted so that the output is optimized. In order to train a neural network, a </w:t>
-      </w:r>
-      <w:r>
-        <w:rPr>
-          <w:rFonts w:ascii="Calibri" w:hAnsi="Calibri" w:cs="Calibri"/>
-          <w:b/>
-          <w:sz w:val="24"/>
-          <w:szCs w:val="24"/>
-        </w:rPr>
-        <w:t>dataset</w:t>
-      </w:r>
-      <w:r>
-        <w:rPr>
-          <w:rFonts w:ascii="Calibri" w:hAnsi="Calibri" w:cs="Calibri"/>
-          <w:sz w:val="24"/>
-          <w:szCs w:val="24"/>
-        </w:rPr>
-        <w:t xml:space="preserve"> is needed. This dataset is used to train the neural network so t</w:t>
-      </w:r>
-      <w:r>
-        <w:rPr>
-          <w:rFonts w:ascii="Calibri" w:hAnsi="Calibri" w:cs="Calibri"/>
-          <w:sz w:val="24"/>
-          <w:szCs w:val="24"/>
-        </w:rPr>
-        <w:t>hat it can learn from the data.</w:t>
-      </w:r>
-    </w:p>
-    <w:p>
-      <w:pPr>
-        <w:rPr>
-          <w:rFonts w:ascii="Calibri" w:hAnsi="Calibri" w:cs="Calibri"/>
-          <w:sz w:val="24"/>
-          <w:szCs w:val="24"/>
-        </w:rPr>
-      </w:pPr>
-    </w:p>
-    <w:p>
-      <w:pPr>
-        <w:rPr>
-          <w:rFonts w:ascii="Calibri" w:hAnsi="Calibri" w:cs="Calibri"/>
-          <w:b/>
-          <w:sz w:val="24"/>
-          <w:szCs w:val="24"/>
-        </w:rPr>
-      </w:pPr>
-      <w:r>
-        <w:rPr>
-          <w:rFonts w:ascii="Calibri" w:hAnsi="Calibri" w:cs="Calibri"/>
-          <w:b/>
-          <w:sz w:val="24"/>
-          <w:szCs w:val="24"/>
-        </w:rPr>
-        <w:t>The training process involves adjusting the weights so that the output of the neural network is as close as possible to the desired output.</w:t>
-      </w:r>
-    </w:p>
-    <w:p>
-      <w:pPr>
-        <w:rPr>
-          <w:rFonts w:ascii="Calibri" w:hAnsi="Calibri" w:cs="Calibri"/>
-          <w:sz w:val="24"/>
-          <w:szCs w:val="24"/>
-        </w:rPr>
-      </w:pPr>
-    </w:p>
-    <w:p>
-      <w:pPr>
-        <w:rPr>
-          <w:rFonts w:ascii="Calibri" w:hAnsi="Calibri" w:cs="Calibri"/>
-          <w:sz w:val="24"/>
-          <w:szCs w:val="24"/>
-        </w:rPr>
-      </w:pPr>
-      <w:r>
-        <w:rPr>
-          <w:rFonts w:ascii="Calibri" w:hAnsi="Calibri" w:cs="Calibri"/>
-          <w:sz w:val="24"/>
-          <w:szCs w:val="24"/>
-        </w:rPr>
-        <w:t xml:space="preserve">Neural networks have many advantages over traditional machine learning algorithms, such as being able to learn complex patterns in data. They are also able to generalize well, meaning that they can accurately classify new data that it has not seen before. The applications of neural networks are vast and growing. They are being used in a variety of fields, from </w:t>
-      </w:r>
-      <w:r>
-        <w:rPr>
-          <w:rFonts w:ascii="Calibri" w:hAnsi="Calibri" w:cs="Calibri"/>
-          <w:b/>
-          <w:sz w:val="24"/>
-          <w:szCs w:val="24"/>
-        </w:rPr>
-        <w:t>healthcare to finance</w:t>
-      </w:r>
-      <w:r>
-        <w:rPr>
-          <w:rFonts w:ascii="Calibri" w:hAnsi="Calibri" w:cs="Calibri"/>
-          <w:sz w:val="24"/>
-          <w:szCs w:val="24"/>
-        </w:rPr>
-        <w:t>. As research in this area progresses, it is likely that neural networks will be used in more and more areas.</w:t>
+        <w:t>networks will be used in more and more areas.</w:t>
       </w:r>
     </w:p>
     <w:p>
@@ -1964,7 +2009,6 @@
           <w:sz w:val="28"/>
           <w:szCs w:val="28"/>
         </w:rPr>
-        <w:lastRenderedPageBreak/>
         <w:t>Features</w:t>
       </w:r>
       <w:r>
@@ -2159,7 +2203,16 @@
           <w:sz w:val="24"/>
           <w:szCs w:val="24"/>
         </w:rPr>
-        <w:t>: WINTER can be used to open and view pictures stored on the user’s computer. This feature makes it easy to quickly browse through large collections of photos.</w:t>
+        <w:t xml:space="preserve">: WINTER can be used to open and view pictures stored on the user’s computer. This feature makes it </w:t>
+      </w:r>
+      <w:r>
+        <w:rPr>
+          <w:rFonts w:ascii="Calibri" w:hAnsi="Calibri" w:cs="Calibri"/>
+          <w:sz w:val="24"/>
+          <w:szCs w:val="24"/>
+        </w:rPr>
+        <w:lastRenderedPageBreak/>
+        <w:t>easy to quickly browse through large collections of photos.</w:t>
       </w:r>
     </w:p>
     <w:p>
@@ -2194,16 +2247,7 @@
           <w:sz w:val="24"/>
           <w:szCs w:val="24"/>
         </w:rPr>
-        <w:t xml:space="preserve">: WINTER can be used to play back video files stored on the user’s </w:t>
-      </w:r>
-      <w:r>
-        <w:rPr>
-          <w:rFonts w:ascii="Calibri" w:hAnsi="Calibri" w:cs="Calibri"/>
-          <w:sz w:val="24"/>
-          <w:szCs w:val="24"/>
-        </w:rPr>
-        <w:lastRenderedPageBreak/>
-        <w:t>computer. This makes it easy to watch movies and other video files without having to rely on a separate video player application.</w:t>
+        <w:t>: WINTER can be used to play back video files stored on the user’s computer. This makes it easy to watch movies and other video files without having to rely on a separate video player application.</w:t>
       </w:r>
     </w:p>
     <w:p>
@@ -2540,8 +2584,6 @@
           <w:lang w:val="en-US"/>
         </w:rPr>
       </w:pPr>
-      <w:bookmarkStart w:id="0" w:name="_GoBack"/>
-      <w:bookmarkEnd w:id="0"/>
     </w:p>
     <w:p>
       <w:pPr>
@@ -2579,6 +2621,7 @@
           <w:sz w:val="24"/>
           <w:szCs w:val="24"/>
         </w:rPr>
+        <w:lastRenderedPageBreak/>
         <w:t>1. Email</w:t>
       </w:r>
       <w:r>
@@ -2622,16 +2665,7 @@
           <w:sz w:val="24"/>
           <w:szCs w:val="24"/>
         </w:rPr>
-        <w:t xml:space="preserve">: WINTER can be used to view and manage the user’s </w:t>
-      </w:r>
-      <w:r>
-        <w:rPr>
-          <w:rFonts w:ascii="Calibri" w:hAnsi="Calibri" w:cs="Calibri"/>
-          <w:sz w:val="24"/>
-          <w:szCs w:val="24"/>
-        </w:rPr>
-        <w:lastRenderedPageBreak/>
-        <w:t>calendar. This feature makes it easy to quickly and easily keep track of important dates and events.</w:t>
+        <w:t>: WINTER can be used to view and manage the user’s calendar. This feature makes it easy to quickly and easily keep track of important dates and events.</w:t>
       </w:r>
     </w:p>
     <w:p>
@@ -2738,6 +2772,51 @@
         </w:rPr>
         <w:t>: WINTER can be used to access and manage social media accounts. This feature makes it easy to quickly and easily stay connected with your friends and family on social media.</w:t>
       </w:r>
+    </w:p>
+    <w:p>
+      <w:pPr>
+        <w:rPr>
+          <w:rFonts w:ascii="Calibri" w:hAnsi="Calibri" w:cs="Calibri"/>
+          <w:sz w:val="24"/>
+          <w:szCs w:val="24"/>
+        </w:rPr>
+      </w:pPr>
+    </w:p>
+    <w:p>
+      <w:pPr>
+        <w:rPr>
+          <w:rFonts w:ascii="Calibri" w:hAnsi="Calibri" w:cs="Calibri"/>
+          <w:sz w:val="24"/>
+          <w:szCs w:val="24"/>
+        </w:rPr>
+      </w:pPr>
+    </w:p>
+    <w:p>
+      <w:pPr>
+        <w:rPr>
+          <w:rFonts w:ascii="Calibri" w:hAnsi="Calibri" w:cs="Calibri"/>
+          <w:sz w:val="24"/>
+          <w:szCs w:val="24"/>
+        </w:rPr>
+      </w:pPr>
+    </w:p>
+    <w:p>
+      <w:pPr>
+        <w:rPr>
+          <w:rFonts w:ascii="Calibri" w:hAnsi="Calibri" w:cs="Calibri"/>
+          <w:sz w:val="24"/>
+          <w:szCs w:val="24"/>
+        </w:rPr>
+      </w:pPr>
+    </w:p>
+    <w:p>
+      <w:pPr>
+        <w:rPr>
+          <w:rFonts w:ascii="Calibri" w:hAnsi="Calibri" w:cs="Calibri"/>
+          <w:sz w:val="24"/>
+          <w:szCs w:val="24"/>
+        </w:rPr>
+      </w:pPr>
     </w:p>
     <w:p>
       <w:pPr>
@@ -3092,7 +3171,16 @@
           <w:sz w:val="24"/>
           <w:szCs w:val="24"/>
         </w:rPr>
-        <w:t xml:space="preserve"> in order to improve its performance. The AI was able to improve its performance over time, which indicates that the system was successfully able to learn from its interactions with its environment. This research provides a great foundation for further development of AI systems that could potentially be used in a variety of applications.</w:t>
+        <w:t xml:space="preserve"> in order to improve its performance. The AI was able to improve its performance over time, which indicates that the system was successfully able to learn from its interactions with its environment. This research provides a great </w:t>
+      </w:r>
+      <w:r>
+        <w:rPr>
+          <w:rFonts w:ascii="Calibri" w:hAnsi="Calibri" w:cs="Calibri"/>
+          <w:sz w:val="24"/>
+          <w:szCs w:val="24"/>
+        </w:rPr>
+        <w:lastRenderedPageBreak/>
+        <w:t>foundation for further development of AI systems that could potentially be used in a variety of applications.</w:t>
       </w:r>
     </w:p>
     <w:p>

</xml_diff>